<commit_message>
update: interated paymongo as payment gateway
</commit_message>
<xml_diff>
--- a/docs/Knot_and_Bloom_Business_Model.docx
+++ b/docs/Knot_and_Bloom_Business_Model.docx
@@ -16,7 +16,7 @@
           <w:rFonts w:ascii="Georgia" w:cs="Georgia" w:eastAsia="Georgia" w:hAnsi="Georgia"/>
           <w:b/>
           <w:bCs/>
-          <w:color w:val="9C4A3C"/>
+          <w:color w:val="B36979"/>
           <w:sz w:val="64"/>
           <w:szCs w:val="64"/>
         </w:rPr>
@@ -33,7 +33,7 @@
           <w:rFonts w:ascii="Georgia" w:cs="Georgia" w:eastAsia="Georgia" w:hAnsi="Georgia"/>
           <w:i/>
           <w:iCs/>
-          <w:color w:val="5B6B4F"/>
+          <w:color w:val="567F4F"/>
           <w:sz w:val="22"/>
           <w:szCs w:val="22"/>
         </w:rPr>
@@ -59,7 +59,7 @@
           <w:rFonts w:ascii="Georgia" w:cs="Georgia" w:eastAsia="Georgia" w:hAnsi="Georgia"/>
           <w:b/>
           <w:bCs/>
-          <w:color w:val="2B2118"/>
+          <w:color w:val="1F2937"/>
           <w:sz w:val="34"/>
           <w:szCs w:val="34"/>
         </w:rPr>
@@ -74,7 +74,7 @@
       <w:r>
         <w:rPr>
           <w:rFonts w:ascii="Calibri" w:cs="Calibri" w:eastAsia="Calibri" w:hAnsi="Calibri"/>
-          <w:color w:val="6B6459"/>
+          <w:color w:val="4B5563"/>
           <w:sz w:val="24"/>
           <w:szCs w:val="24"/>
         </w:rPr>
@@ -89,7 +89,7 @@
       <w:r>
         <w:rPr>
           <w:rFonts w:ascii="Calibri" w:cs="Calibri" w:eastAsia="Calibri" w:hAnsi="Calibri"/>
-          <w:color w:val="6B6459"/>
+          <w:color w:val="4B5563"/>
           <w:sz w:val="20"/>
           <w:szCs w:val="20"/>
         </w:rPr>
@@ -106,7 +106,7 @@
           <w:rFonts w:ascii="Calibri" w:cs="Calibri" w:eastAsia="Calibri" w:hAnsi="Calibri"/>
           <w:i/>
           <w:iCs/>
-          <w:color w:val="6B6459"/>
+          <w:color w:val="4B5563"/>
           <w:sz w:val="18"/>
           <w:szCs w:val="18"/>
         </w:rPr>
@@ -127,7 +127,7 @@
       <w:pPr>
         <w:pStyle w:val="Heading1"/>
         <w:pBdr>
-          <w:bottom w:val="single" w:color="9C4A3C" w:sz="8" w:space="6"/>
+          <w:bottom w:val="single" w:color="B36979" w:sz="8" w:space="6"/>
         </w:pBdr>
         <w:spacing w:after="200" w:before="480"/>
       </w:pPr>
@@ -136,7 +136,7 @@
           <w:rFonts w:ascii="Georgia" w:cs="Georgia" w:eastAsia="Georgia" w:hAnsi="Georgia"/>
           <w:b/>
           <w:bCs/>
-          <w:color w:val="9C4A3C"/>
+          <w:color w:val="B36979"/>
           <w:sz w:val="30"/>
           <w:szCs w:val="30"/>
         </w:rPr>
@@ -155,7 +155,7 @@
           <w:rFonts w:ascii="Calibri" w:cs="Calibri" w:eastAsia="Calibri" w:hAnsi="Calibri"/>
           <w:b/>
           <w:bCs/>
-          <w:color w:val="2B2118"/>
+          <w:color w:val="1F2937"/>
           <w:sz w:val="21"/>
           <w:szCs w:val="21"/>
         </w:rPr>
@@ -164,7 +164,7 @@
       <w:r>
         <w:rPr>
           <w:rFonts w:ascii="Calibri" w:cs="Calibri" w:eastAsia="Calibri" w:hAnsi="Calibri"/>
-          <w:color w:val="2B2118"/>
+          <w:color w:val="1F2937"/>
           <w:sz w:val="21"/>
           <w:szCs w:val="21"/>
         </w:rPr>
@@ -183,7 +183,7 @@
           <w:rFonts w:ascii="Calibri" w:cs="Calibri" w:eastAsia="Calibri" w:hAnsi="Calibri"/>
           <w:b/>
           <w:bCs/>
-          <w:color w:val="2B2118"/>
+          <w:color w:val="1F2937"/>
           <w:sz w:val="21"/>
           <w:szCs w:val="21"/>
         </w:rPr>
@@ -192,7 +192,7 @@
       <w:r>
         <w:rPr>
           <w:rFonts w:ascii="Calibri" w:cs="Calibri" w:eastAsia="Calibri" w:hAnsi="Calibri"/>
-          <w:color w:val="2B2118"/>
+          <w:color w:val="1F2937"/>
           <w:sz w:val="21"/>
           <w:szCs w:val="21"/>
         </w:rPr>
@@ -211,7 +211,7 @@
           <w:rFonts w:ascii="Calibri" w:cs="Calibri" w:eastAsia="Calibri" w:hAnsi="Calibri"/>
           <w:b/>
           <w:bCs/>
-          <w:color w:val="2B2118"/>
+          <w:color w:val="1F2937"/>
           <w:sz w:val="21"/>
           <w:szCs w:val="21"/>
         </w:rPr>
@@ -220,7 +220,7 @@
       <w:r>
         <w:rPr>
           <w:rFonts w:ascii="Calibri" w:cs="Calibri" w:eastAsia="Calibri" w:hAnsi="Calibri"/>
-          <w:color w:val="2B2118"/>
+          <w:color w:val="1F2937"/>
           <w:sz w:val="21"/>
           <w:szCs w:val="21"/>
         </w:rPr>
@@ -239,7 +239,7 @@
           <w:rFonts w:ascii="Calibri" w:cs="Calibri" w:eastAsia="Calibri" w:hAnsi="Calibri"/>
           <w:b/>
           <w:bCs/>
-          <w:color w:val="2B2118"/>
+          <w:color w:val="1F2937"/>
           <w:sz w:val="21"/>
           <w:szCs w:val="21"/>
         </w:rPr>
@@ -248,7 +248,7 @@
       <w:r>
         <w:rPr>
           <w:rFonts w:ascii="Calibri" w:cs="Calibri" w:eastAsia="Calibri" w:hAnsi="Calibri"/>
-          <w:color w:val="2B2118"/>
+          <w:color w:val="1F2937"/>
           <w:sz w:val="21"/>
           <w:szCs w:val="21"/>
         </w:rPr>
@@ -267,7 +267,7 @@
           <w:rFonts w:ascii="Calibri" w:cs="Calibri" w:eastAsia="Calibri" w:hAnsi="Calibri"/>
           <w:b/>
           <w:bCs/>
-          <w:color w:val="2B2118"/>
+          <w:color w:val="1F2937"/>
           <w:sz w:val="21"/>
           <w:szCs w:val="21"/>
         </w:rPr>
@@ -276,7 +276,7 @@
       <w:r>
         <w:rPr>
           <w:rFonts w:ascii="Calibri" w:cs="Calibri" w:eastAsia="Calibri" w:hAnsi="Calibri"/>
-          <w:color w:val="2B2118"/>
+          <w:color w:val="1F2937"/>
           <w:sz w:val="21"/>
           <w:szCs w:val="21"/>
         </w:rPr>
@@ -295,7 +295,7 @@
           <w:rFonts w:ascii="Calibri" w:cs="Calibri" w:eastAsia="Calibri" w:hAnsi="Calibri"/>
           <w:b/>
           <w:bCs/>
-          <w:color w:val="2B2118"/>
+          <w:color w:val="1F2937"/>
           <w:sz w:val="21"/>
           <w:szCs w:val="21"/>
         </w:rPr>
@@ -304,7 +304,7 @@
       <w:r>
         <w:rPr>
           <w:rFonts w:ascii="Calibri" w:cs="Calibri" w:eastAsia="Calibri" w:hAnsi="Calibri"/>
-          <w:color w:val="2B2118"/>
+          <w:color w:val="1F2937"/>
           <w:sz w:val="21"/>
           <w:szCs w:val="21"/>
         </w:rPr>
@@ -323,7 +323,7 @@
           <w:rFonts w:ascii="Calibri" w:cs="Calibri" w:eastAsia="Calibri" w:hAnsi="Calibri"/>
           <w:b/>
           <w:bCs/>
-          <w:color w:val="2B2118"/>
+          <w:color w:val="1F2937"/>
           <w:sz w:val="21"/>
           <w:szCs w:val="21"/>
         </w:rPr>
@@ -332,7 +332,7 @@
       <w:r>
         <w:rPr>
           <w:rFonts w:ascii="Calibri" w:cs="Calibri" w:eastAsia="Calibri" w:hAnsi="Calibri"/>
-          <w:color w:val="2B2118"/>
+          <w:color w:val="1F2937"/>
           <w:sz w:val="21"/>
           <w:szCs w:val="21"/>
         </w:rPr>
@@ -351,7 +351,7 @@
           <w:rFonts w:ascii="Calibri" w:cs="Calibri" w:eastAsia="Calibri" w:hAnsi="Calibri"/>
           <w:b/>
           <w:bCs/>
-          <w:color w:val="2B2118"/>
+          <w:color w:val="1F2937"/>
           <w:sz w:val="21"/>
           <w:szCs w:val="21"/>
         </w:rPr>
@@ -360,7 +360,7 @@
       <w:r>
         <w:rPr>
           <w:rFonts w:ascii="Calibri" w:cs="Calibri" w:eastAsia="Calibri" w:hAnsi="Calibri"/>
-          <w:color w:val="2B2118"/>
+          <w:color w:val="1F2937"/>
           <w:sz w:val="21"/>
           <w:szCs w:val="21"/>
         </w:rPr>
@@ -379,7 +379,7 @@
           <w:rFonts w:ascii="Calibri" w:cs="Calibri" w:eastAsia="Calibri" w:hAnsi="Calibri"/>
           <w:b/>
           <w:bCs/>
-          <w:color w:val="2B2118"/>
+          <w:color w:val="1F2937"/>
           <w:sz w:val="21"/>
           <w:szCs w:val="21"/>
         </w:rPr>
@@ -388,7 +388,7 @@
       <w:r>
         <w:rPr>
           <w:rFonts w:ascii="Calibri" w:cs="Calibri" w:eastAsia="Calibri" w:hAnsi="Calibri"/>
-          <w:color w:val="2B2118"/>
+          <w:color w:val="1F2937"/>
           <w:sz w:val="21"/>
           <w:szCs w:val="21"/>
         </w:rPr>
@@ -407,7 +407,7 @@
           <w:rFonts w:ascii="Calibri" w:cs="Calibri" w:eastAsia="Calibri" w:hAnsi="Calibri"/>
           <w:b/>
           <w:bCs/>
-          <w:color w:val="2B2118"/>
+          <w:color w:val="1F2937"/>
           <w:sz w:val="21"/>
           <w:szCs w:val="21"/>
         </w:rPr>
@@ -416,7 +416,7 @@
       <w:r>
         <w:rPr>
           <w:rFonts w:ascii="Calibri" w:cs="Calibri" w:eastAsia="Calibri" w:hAnsi="Calibri"/>
-          <w:color w:val="2B2118"/>
+          <w:color w:val="1F2937"/>
           <w:sz w:val="21"/>
           <w:szCs w:val="21"/>
         </w:rPr>
@@ -435,7 +435,7 @@
           <w:rFonts w:ascii="Calibri" w:cs="Calibri" w:eastAsia="Calibri" w:hAnsi="Calibri"/>
           <w:b/>
           <w:bCs/>
-          <w:color w:val="2B2118"/>
+          <w:color w:val="1F2937"/>
           <w:sz w:val="21"/>
           <w:szCs w:val="21"/>
         </w:rPr>
@@ -444,7 +444,7 @@
       <w:r>
         <w:rPr>
           <w:rFonts w:ascii="Calibri" w:cs="Calibri" w:eastAsia="Calibri" w:hAnsi="Calibri"/>
-          <w:color w:val="2B2118"/>
+          <w:color w:val="1F2937"/>
           <w:sz w:val="21"/>
           <w:szCs w:val="21"/>
         </w:rPr>
@@ -463,7 +463,7 @@
           <w:rFonts w:ascii="Calibri" w:cs="Calibri" w:eastAsia="Calibri" w:hAnsi="Calibri"/>
           <w:b/>
           <w:bCs/>
-          <w:color w:val="2B2118"/>
+          <w:color w:val="1F2937"/>
           <w:sz w:val="21"/>
           <w:szCs w:val="21"/>
         </w:rPr>
@@ -472,7 +472,7 @@
       <w:r>
         <w:rPr>
           <w:rFonts w:ascii="Calibri" w:cs="Calibri" w:eastAsia="Calibri" w:hAnsi="Calibri"/>
-          <w:color w:val="2B2118"/>
+          <w:color w:val="1F2937"/>
           <w:sz w:val="21"/>
           <w:szCs w:val="21"/>
         </w:rPr>
@@ -491,7 +491,7 @@
           <w:rFonts w:ascii="Calibri" w:cs="Calibri" w:eastAsia="Calibri" w:hAnsi="Calibri"/>
           <w:b/>
           <w:bCs/>
-          <w:color w:val="2B2118"/>
+          <w:color w:val="1F2937"/>
           <w:sz w:val="21"/>
           <w:szCs w:val="21"/>
         </w:rPr>
@@ -500,7 +500,7 @@
       <w:r>
         <w:rPr>
           <w:rFonts w:ascii="Calibri" w:cs="Calibri" w:eastAsia="Calibri" w:hAnsi="Calibri"/>
-          <w:color w:val="2B2118"/>
+          <w:color w:val="1F2937"/>
           <w:sz w:val="21"/>
           <w:szCs w:val="21"/>
         </w:rPr>
@@ -519,7 +519,7 @@
           <w:rFonts w:ascii="Calibri" w:cs="Calibri" w:eastAsia="Calibri" w:hAnsi="Calibri"/>
           <w:b/>
           <w:bCs/>
-          <w:color w:val="2B2118"/>
+          <w:color w:val="1F2937"/>
           <w:sz w:val="21"/>
           <w:szCs w:val="21"/>
         </w:rPr>
@@ -528,7 +528,7 @@
       <w:r>
         <w:rPr>
           <w:rFonts w:ascii="Calibri" w:cs="Calibri" w:eastAsia="Calibri" w:hAnsi="Calibri"/>
-          <w:color w:val="2B2118"/>
+          <w:color w:val="1F2937"/>
           <w:sz w:val="21"/>
           <w:szCs w:val="21"/>
         </w:rPr>
@@ -549,7 +549,7 @@
       <w:pPr>
         <w:pStyle w:val="Heading1"/>
         <w:pBdr>
-          <w:bottom w:val="single" w:color="9C4A3C" w:sz="8" w:space="6"/>
+          <w:bottom w:val="single" w:color="B36979" w:sz="8" w:space="6"/>
         </w:pBdr>
         <w:spacing w:after="200" w:before="480"/>
       </w:pPr>
@@ -558,7 +558,7 @@
           <w:rFonts w:ascii="Georgia" w:cs="Georgia" w:eastAsia="Georgia" w:hAnsi="Georgia"/>
           <w:b/>
           <w:bCs/>
-          <w:color w:val="9C4A3C"/>
+          <w:color w:val="B36979"/>
           <w:sz w:val="30"/>
           <w:szCs w:val="30"/>
         </w:rPr>
@@ -574,7 +574,7 @@
           <w:rFonts w:ascii="Calibri" w:cs="Calibri" w:eastAsia="Calibri" w:hAnsi="Calibri"/>
           <w:i w:val="false"/>
           <w:iCs w:val="false"/>
-          <w:color w:val="2B2118"/>
+          <w:color w:val="1F2937"/>
           <w:sz w:val="21"/>
           <w:szCs w:val="21"/>
         </w:rPr>
@@ -591,7 +591,7 @@
           <w:rFonts w:ascii="Calibri" w:cs="Calibri" w:eastAsia="Calibri" w:hAnsi="Calibri"/>
           <w:b/>
           <w:bCs/>
-          <w:color w:val="5B6B4F"/>
+          <w:color w:val="567F4F"/>
           <w:sz w:val="22"/>
           <w:szCs w:val="22"/>
         </w:rPr>
@@ -610,7 +610,7 @@
       <w:r>
         <w:rPr>
           <w:rFonts w:ascii="Calibri" w:cs="Calibri" w:eastAsia="Calibri" w:hAnsi="Calibri"/>
-          <w:color w:val="2B2118"/>
+          <w:color w:val="1F2937"/>
           <w:sz w:val="21"/>
           <w:szCs w:val="21"/>
         </w:rPr>
@@ -629,7 +629,7 @@
       <w:r>
         <w:rPr>
           <w:rFonts w:ascii="Calibri" w:cs="Calibri" w:eastAsia="Calibri" w:hAnsi="Calibri"/>
-          <w:color w:val="2B2118"/>
+          <w:color w:val="1F2937"/>
           <w:sz w:val="21"/>
           <w:szCs w:val="21"/>
         </w:rPr>
@@ -648,7 +648,7 @@
       <w:r>
         <w:rPr>
           <w:rFonts w:ascii="Calibri" w:cs="Calibri" w:eastAsia="Calibri" w:hAnsi="Calibri"/>
-          <w:color w:val="2B2118"/>
+          <w:color w:val="1F2937"/>
           <w:sz w:val="21"/>
           <w:szCs w:val="21"/>
         </w:rPr>
@@ -667,7 +667,7 @@
       <w:r>
         <w:rPr>
           <w:rFonts w:ascii="Calibri" w:cs="Calibri" w:eastAsia="Calibri" w:hAnsi="Calibri"/>
-          <w:color w:val="2B2118"/>
+          <w:color w:val="1F2937"/>
           <w:sz w:val="21"/>
           <w:szCs w:val="21"/>
         </w:rPr>
@@ -684,7 +684,7 @@
           <w:rFonts w:ascii="Calibri" w:cs="Calibri" w:eastAsia="Calibri" w:hAnsi="Calibri"/>
           <w:b/>
           <w:bCs/>
-          <w:color w:val="5B6B4F"/>
+          <w:color w:val="567F4F"/>
           <w:sz w:val="22"/>
           <w:szCs w:val="22"/>
         </w:rPr>
@@ -698,7 +698,7 @@
       <w:r>
         <w:rPr>
           <w:rFonts w:ascii="Calibri" w:cs="Calibri" w:eastAsia="Calibri" w:hAnsi="Calibri"/>
-          <w:color w:val="2B2118"/>
+          <w:color w:val="1F2937"/>
           <w:sz w:val="21"/>
           <w:szCs w:val="21"/>
         </w:rPr>
@@ -709,7 +709,7 @@
           <w:rFonts w:ascii="Calibri" w:cs="Calibri" w:eastAsia="Calibri" w:hAnsi="Calibri"/>
           <w:i/>
           <w:iCs/>
-          <w:color w:val="9C4A3C"/>
+          <w:color w:val="B36979"/>
           <w:sz w:val="21"/>
           <w:szCs w:val="21"/>
         </w:rPr>
@@ -718,7 +718,7 @@
       <w:r>
         <w:rPr>
           <w:rFonts w:ascii="Calibri" w:cs="Calibri" w:eastAsia="Calibri" w:hAnsi="Calibri"/>
-          <w:color w:val="2B2118"/>
+          <w:color w:val="1F2937"/>
           <w:sz w:val="21"/>
           <w:szCs w:val="21"/>
         </w:rPr>
@@ -729,7 +729,7 @@
       <w:pPr>
         <w:pStyle w:val="Heading1"/>
         <w:pBdr>
-          <w:bottom w:val="single" w:color="9C4A3C" w:sz="8" w:space="6"/>
+          <w:bottom w:val="single" w:color="B36979" w:sz="8" w:space="6"/>
         </w:pBdr>
         <w:spacing w:after="200" w:before="480"/>
       </w:pPr>
@@ -738,7 +738,7 @@
           <w:rFonts w:ascii="Georgia" w:cs="Georgia" w:eastAsia="Georgia" w:hAnsi="Georgia"/>
           <w:b/>
           <w:bCs/>
-          <w:color w:val="9C4A3C"/>
+          <w:color w:val="B36979"/>
           <w:sz w:val="30"/>
           <w:szCs w:val="30"/>
         </w:rPr>
@@ -754,7 +754,7 @@
           <w:rFonts w:ascii="Calibri" w:cs="Calibri" w:eastAsia="Calibri" w:hAnsi="Calibri"/>
           <w:i w:val="false"/>
           <w:iCs w:val="false"/>
-          <w:color w:val="2B2118"/>
+          <w:color w:val="1F2937"/>
           <w:sz w:val="21"/>
           <w:szCs w:val="21"/>
         </w:rPr>
@@ -784,7 +784,7 @@
         <w:tc>
           <w:tcPr>
             <w:tcW w:type="dxa" w:w="2600"/>
-            <w:shd w:fill="9C4A3C" w:val="clear"/>
+            <w:shd w:fill="B36979" w:val="clear"/>
             <w:tcMar>
               <w:top w:type="dxa" w:w="100"/>
               <w:left w:type="dxa" w:w="120"/>
@@ -813,7 +813,7 @@
         <w:tc>
           <w:tcPr>
             <w:tcW w:type="dxa" w:w="7100"/>
-            <w:shd w:fill="9C4A3C" w:val="clear"/>
+            <w:shd w:fill="B36979" w:val="clear"/>
             <w:tcMar>
               <w:top w:type="dxa" w:w="100"/>
               <w:left w:type="dxa" w:w="120"/>
@@ -844,7 +844,7 @@
         <w:tc>
           <w:tcPr>
             <w:tcW w:type="dxa" w:w="2600"/>
-            <w:shd w:fill="F7F2EA" w:val="clear"/>
+            <w:shd w:fill="FCFAF9" w:val="clear"/>
             <w:tcMar>
               <w:top w:type="dxa" w:w="100"/>
               <w:left w:type="dxa" w:w="120"/>
@@ -862,7 +862,7 @@
                 <w:rFonts w:ascii="Calibri" w:cs="Calibri" w:eastAsia="Calibri" w:hAnsi="Calibri"/>
                 <w:b/>
                 <w:bCs/>
-                <w:color w:val="5B6B4F"/>
+                <w:color w:val="567F4F"/>
                 <w:sz w:val="20"/>
                 <w:szCs w:val="20"/>
               </w:rPr>
@@ -873,7 +873,7 @@
         <w:tc>
           <w:tcPr>
             <w:tcW w:type="dxa" w:w="7100"/>
-            <w:shd w:fill="F7F2EA" w:val="clear"/>
+            <w:shd w:fill="FCFAF9" w:val="clear"/>
             <w:tcMar>
               <w:top w:type="dxa" w:w="100"/>
               <w:left w:type="dxa" w:w="120"/>
@@ -891,7 +891,7 @@
                 <w:rFonts w:ascii="Calibri" w:cs="Calibri" w:eastAsia="Calibri" w:hAnsi="Calibri"/>
                 <w:b w:val="false"/>
                 <w:bCs w:val="false"/>
-                <w:color w:val="2B2118"/>
+                <w:color w:val="1F2937"/>
                 <w:sz w:val="19"/>
                 <w:szCs w:val="19"/>
               </w:rPr>
@@ -922,7 +922,7 @@
                 <w:rFonts w:ascii="Calibri" w:cs="Calibri" w:eastAsia="Calibri" w:hAnsi="Calibri"/>
                 <w:b/>
                 <w:bCs/>
-                <w:color w:val="5B6B4F"/>
+                <w:color w:val="567F4F"/>
                 <w:sz w:val="20"/>
                 <w:szCs w:val="20"/>
               </w:rPr>
@@ -951,7 +951,7 @@
                 <w:rFonts w:ascii="Calibri" w:cs="Calibri" w:eastAsia="Calibri" w:hAnsi="Calibri"/>
                 <w:b w:val="false"/>
                 <w:bCs w:val="false"/>
-                <w:color w:val="2B2118"/>
+                <w:color w:val="1F2937"/>
                 <w:sz w:val="19"/>
                 <w:szCs w:val="19"/>
               </w:rPr>
@@ -964,7 +964,7 @@
         <w:tc>
           <w:tcPr>
             <w:tcW w:type="dxa" w:w="2600"/>
-            <w:shd w:fill="F7F2EA" w:val="clear"/>
+            <w:shd w:fill="FCFAF9" w:val="clear"/>
             <w:tcMar>
               <w:top w:type="dxa" w:w="100"/>
               <w:left w:type="dxa" w:w="120"/>
@@ -982,7 +982,7 @@
                 <w:rFonts w:ascii="Calibri" w:cs="Calibri" w:eastAsia="Calibri" w:hAnsi="Calibri"/>
                 <w:b/>
                 <w:bCs/>
-                <w:color w:val="5B6B4F"/>
+                <w:color w:val="567F4F"/>
                 <w:sz w:val="20"/>
                 <w:szCs w:val="20"/>
               </w:rPr>
@@ -993,7 +993,7 @@
         <w:tc>
           <w:tcPr>
             <w:tcW w:type="dxa" w:w="7100"/>
-            <w:shd w:fill="F7F2EA" w:val="clear"/>
+            <w:shd w:fill="FCFAF9" w:val="clear"/>
             <w:tcMar>
               <w:top w:type="dxa" w:w="100"/>
               <w:left w:type="dxa" w:w="120"/>
@@ -1011,11 +1011,11 @@
                 <w:rFonts w:ascii="Calibri" w:cs="Calibri" w:eastAsia="Calibri" w:hAnsi="Calibri"/>
                 <w:b w:val="false"/>
                 <w:bCs w:val="false"/>
-                <w:color w:val="2B2118"/>
+                <w:color w:val="1F2937"/>
                 <w:sz w:val="19"/>
                 <w:szCs w:val="19"/>
               </w:rPr>
-              <w:t xml:space="preserve">Transaction commission (12% flat at launch, tiered by seller subscription later), seller subscriptions (Growth / Studio), promotion boosts (₱49/3-day).</w:t>
+              <w:t xml:space="preserve">Transaction commission (5% flat at launch, tiered by seller subscription later), seller subscriptions (Growth / Studio), promotion boosts (₱49/3-day). PayMongo's own processing fee is deducted separately and is not part of Knot &amp; Bloom's revenue.</w:t>
             </w:r>
           </w:p>
         </w:tc>
@@ -1042,7 +1042,7 @@
                 <w:rFonts w:ascii="Calibri" w:cs="Calibri" w:eastAsia="Calibri" w:hAnsi="Calibri"/>
                 <w:b/>
                 <w:bCs/>
-                <w:color w:val="5B6B4F"/>
+                <w:color w:val="567F4F"/>
                 <w:sz w:val="20"/>
                 <w:szCs w:val="20"/>
               </w:rPr>
@@ -1071,7 +1071,7 @@
                 <w:rFonts w:ascii="Calibri" w:cs="Calibri" w:eastAsia="Calibri" w:hAnsi="Calibri"/>
                 <w:b w:val="false"/>
                 <w:bCs w:val="false"/>
-                <w:color w:val="2B2118"/>
+                <w:color w:val="1F2937"/>
                 <w:sz w:val="19"/>
                 <w:szCs w:val="19"/>
               </w:rPr>
@@ -1084,7 +1084,7 @@
         <w:tc>
           <w:tcPr>
             <w:tcW w:type="dxa" w:w="2600"/>
-            <w:shd w:fill="F7F2EA" w:val="clear"/>
+            <w:shd w:fill="FCFAF9" w:val="clear"/>
             <w:tcMar>
               <w:top w:type="dxa" w:w="100"/>
               <w:left w:type="dxa" w:w="120"/>
@@ -1102,7 +1102,7 @@
                 <w:rFonts w:ascii="Calibri" w:cs="Calibri" w:eastAsia="Calibri" w:hAnsi="Calibri"/>
                 <w:b/>
                 <w:bCs/>
-                <w:color w:val="5B6B4F"/>
+                <w:color w:val="567F4F"/>
                 <w:sz w:val="20"/>
                 <w:szCs w:val="20"/>
               </w:rPr>
@@ -1113,7 +1113,7 @@
         <w:tc>
           <w:tcPr>
             <w:tcW w:type="dxa" w:w="7100"/>
-            <w:shd w:fill="F7F2EA" w:val="clear"/>
+            <w:shd w:fill="FCFAF9" w:val="clear"/>
             <w:tcMar>
               <w:top w:type="dxa" w:w="100"/>
               <w:left w:type="dxa" w:w="120"/>
@@ -1131,7 +1131,7 @@
                 <w:rFonts w:ascii="Calibri" w:cs="Calibri" w:eastAsia="Calibri" w:hAnsi="Calibri"/>
                 <w:b w:val="false"/>
                 <w:bCs w:val="false"/>
-                <w:color w:val="2B2118"/>
+                <w:color w:val="1F2937"/>
                 <w:sz w:val="19"/>
                 <w:szCs w:val="19"/>
               </w:rPr>
@@ -1162,7 +1162,7 @@
                 <w:rFonts w:ascii="Calibri" w:cs="Calibri" w:eastAsia="Calibri" w:hAnsi="Calibri"/>
                 <w:b/>
                 <w:bCs/>
-                <w:color w:val="5B6B4F"/>
+                <w:color w:val="567F4F"/>
                 <w:sz w:val="20"/>
                 <w:szCs w:val="20"/>
               </w:rPr>
@@ -1191,7 +1191,7 @@
                 <w:rFonts w:ascii="Calibri" w:cs="Calibri" w:eastAsia="Calibri" w:hAnsi="Calibri"/>
                 <w:b w:val="false"/>
                 <w:bCs w:val="false"/>
-                <w:color w:val="2B2118"/>
+                <w:color w:val="1F2937"/>
                 <w:sz w:val="19"/>
                 <w:szCs w:val="19"/>
               </w:rPr>
@@ -1204,7 +1204,7 @@
         <w:tc>
           <w:tcPr>
             <w:tcW w:type="dxa" w:w="2600"/>
-            <w:shd w:fill="F7F2EA" w:val="clear"/>
+            <w:shd w:fill="FCFAF9" w:val="clear"/>
             <w:tcMar>
               <w:top w:type="dxa" w:w="100"/>
               <w:left w:type="dxa" w:w="120"/>
@@ -1222,7 +1222,7 @@
                 <w:rFonts w:ascii="Calibri" w:cs="Calibri" w:eastAsia="Calibri" w:hAnsi="Calibri"/>
                 <w:b/>
                 <w:bCs/>
-                <w:color w:val="5B6B4F"/>
+                <w:color w:val="567F4F"/>
                 <w:sz w:val="20"/>
                 <w:szCs w:val="20"/>
               </w:rPr>
@@ -1233,7 +1233,7 @@
         <w:tc>
           <w:tcPr>
             <w:tcW w:type="dxa" w:w="7100"/>
-            <w:shd w:fill="F7F2EA" w:val="clear"/>
+            <w:shd w:fill="FCFAF9" w:val="clear"/>
             <w:tcMar>
               <w:top w:type="dxa" w:w="100"/>
               <w:left w:type="dxa" w:w="120"/>
@@ -1251,7 +1251,7 @@
                 <w:rFonts w:ascii="Calibri" w:cs="Calibri" w:eastAsia="Calibri" w:hAnsi="Calibri"/>
                 <w:b w:val="false"/>
                 <w:bCs w:val="false"/>
-                <w:color w:val="2B2118"/>
+                <w:color w:val="1F2937"/>
                 <w:sz w:val="19"/>
                 <w:szCs w:val="19"/>
               </w:rPr>
@@ -1282,7 +1282,7 @@
                 <w:rFonts w:ascii="Calibri" w:cs="Calibri" w:eastAsia="Calibri" w:hAnsi="Calibri"/>
                 <w:b/>
                 <w:bCs/>
-                <w:color w:val="5B6B4F"/>
+                <w:color w:val="567F4F"/>
                 <w:sz w:val="20"/>
                 <w:szCs w:val="20"/>
               </w:rPr>
@@ -1311,7 +1311,7 @@
                 <w:rFonts w:ascii="Calibri" w:cs="Calibri" w:eastAsia="Calibri" w:hAnsi="Calibri"/>
                 <w:b w:val="false"/>
                 <w:bCs w:val="false"/>
-                <w:color w:val="2B2118"/>
+                <w:color w:val="1F2937"/>
                 <w:sz w:val="19"/>
                 <w:szCs w:val="19"/>
               </w:rPr>
@@ -1324,7 +1324,7 @@
         <w:tc>
           <w:tcPr>
             <w:tcW w:type="dxa" w:w="2600"/>
-            <w:shd w:fill="F7F2EA" w:val="clear"/>
+            <w:shd w:fill="FCFAF9" w:val="clear"/>
             <w:tcMar>
               <w:top w:type="dxa" w:w="100"/>
               <w:left w:type="dxa" w:w="120"/>
@@ -1342,7 +1342,7 @@
                 <w:rFonts w:ascii="Calibri" w:cs="Calibri" w:eastAsia="Calibri" w:hAnsi="Calibri"/>
                 <w:b/>
                 <w:bCs/>
-                <w:color w:val="5B6B4F"/>
+                <w:color w:val="567F4F"/>
                 <w:sz w:val="20"/>
                 <w:szCs w:val="20"/>
               </w:rPr>
@@ -1353,7 +1353,7 @@
         <w:tc>
           <w:tcPr>
             <w:tcW w:type="dxa" w:w="7100"/>
-            <w:shd w:fill="F7F2EA" w:val="clear"/>
+            <w:shd w:fill="FCFAF9" w:val="clear"/>
             <w:tcMar>
               <w:top w:type="dxa" w:w="100"/>
               <w:left w:type="dxa" w:w="120"/>
@@ -1371,7 +1371,7 @@
                 <w:rFonts w:ascii="Calibri" w:cs="Calibri" w:eastAsia="Calibri" w:hAnsi="Calibri"/>
                 <w:b w:val="false"/>
                 <w:bCs w:val="false"/>
-                <w:color w:val="2B2118"/>
+                <w:color w:val="1F2937"/>
                 <w:sz w:val="19"/>
                 <w:szCs w:val="19"/>
               </w:rPr>
@@ -1390,7 +1390,7 @@
       <w:pPr>
         <w:pStyle w:val="Heading1"/>
         <w:pBdr>
-          <w:bottom w:val="single" w:color="9C4A3C" w:sz="8" w:space="6"/>
+          <w:bottom w:val="single" w:color="B36979" w:sz="8" w:space="6"/>
         </w:pBdr>
         <w:spacing w:after="200" w:before="480"/>
       </w:pPr>
@@ -1399,7 +1399,7 @@
           <w:rFonts w:ascii="Georgia" w:cs="Georgia" w:eastAsia="Georgia" w:hAnsi="Georgia"/>
           <w:b/>
           <w:bCs/>
-          <w:color w:val="9C4A3C"/>
+          <w:color w:val="B36979"/>
           <w:sz w:val="30"/>
           <w:szCs w:val="30"/>
         </w:rPr>
@@ -1416,7 +1416,7 @@
           <w:rFonts w:ascii="Calibri" w:cs="Calibri" w:eastAsia="Calibri" w:hAnsi="Calibri"/>
           <w:b/>
           <w:bCs/>
-          <w:color w:val="5B6B4F"/>
+          <w:color w:val="567F4F"/>
           <w:sz w:val="22"/>
           <w:szCs w:val="22"/>
         </w:rPr>
@@ -1432,7 +1432,7 @@
           <w:rFonts w:ascii="Calibri" w:cs="Calibri" w:eastAsia="Calibri" w:hAnsi="Calibri"/>
           <w:i w:val="false"/>
           <w:iCs w:val="false"/>
-          <w:color w:val="2B2118"/>
+          <w:color w:val="1F2937"/>
           <w:sz w:val="21"/>
           <w:szCs w:val="21"/>
         </w:rPr>
@@ -1449,7 +1449,7 @@
           <w:rFonts w:ascii="Calibri" w:cs="Calibri" w:eastAsia="Calibri" w:hAnsi="Calibri"/>
           <w:b/>
           <w:bCs/>
-          <w:color w:val="5B6B4F"/>
+          <w:color w:val="567F4F"/>
           <w:sz w:val="22"/>
           <w:szCs w:val="22"/>
         </w:rPr>
@@ -1465,7 +1465,7 @@
           <w:rFonts w:ascii="Calibri" w:cs="Calibri" w:eastAsia="Calibri" w:hAnsi="Calibri"/>
           <w:i w:val="false"/>
           <w:iCs w:val="false"/>
-          <w:color w:val="2B2118"/>
+          <w:color w:val="1F2937"/>
           <w:sz w:val="21"/>
           <w:szCs w:val="21"/>
         </w:rPr>
@@ -1476,7 +1476,7 @@
       <w:pPr>
         <w:pStyle w:val="Heading1"/>
         <w:pBdr>
-          <w:bottom w:val="single" w:color="9C4A3C" w:sz="8" w:space="6"/>
+          <w:bottom w:val="single" w:color="B36979" w:sz="8" w:space="6"/>
         </w:pBdr>
         <w:spacing w:after="200" w:before="480"/>
       </w:pPr>
@@ -1485,7 +1485,7 @@
           <w:rFonts w:ascii="Georgia" w:cs="Georgia" w:eastAsia="Georgia" w:hAnsi="Georgia"/>
           <w:b/>
           <w:bCs/>
-          <w:color w:val="9C4A3C"/>
+          <w:color w:val="B36979"/>
           <w:sz w:val="30"/>
           <w:szCs w:val="30"/>
         </w:rPr>
@@ -1502,7 +1502,7 @@
           <w:rFonts w:ascii="Calibri" w:cs="Calibri" w:eastAsia="Calibri" w:hAnsi="Calibri"/>
           <w:b/>
           <w:bCs/>
-          <w:color w:val="5B6B4F"/>
+          <w:color w:val="567F4F"/>
           <w:sz w:val="22"/>
           <w:szCs w:val="22"/>
         </w:rPr>
@@ -1521,7 +1521,7 @@
       <w:r>
         <w:rPr>
           <w:rFonts w:ascii="Calibri" w:cs="Calibri" w:eastAsia="Calibri" w:hAnsi="Calibri"/>
-          <w:color w:val="2B2118"/>
+          <w:color w:val="1F2937"/>
           <w:sz w:val="21"/>
           <w:szCs w:val="21"/>
         </w:rPr>
@@ -1540,7 +1540,7 @@
       <w:r>
         <w:rPr>
           <w:rFonts w:ascii="Calibri" w:cs="Calibri" w:eastAsia="Calibri" w:hAnsi="Calibri"/>
-          <w:color w:val="2B2118"/>
+          <w:color w:val="1F2937"/>
           <w:sz w:val="21"/>
           <w:szCs w:val="21"/>
         </w:rPr>
@@ -1559,7 +1559,7 @@
       <w:r>
         <w:rPr>
           <w:rFonts w:ascii="Calibri" w:cs="Calibri" w:eastAsia="Calibri" w:hAnsi="Calibri"/>
-          <w:color w:val="2B2118"/>
+          <w:color w:val="1F2937"/>
           <w:sz w:val="21"/>
           <w:szCs w:val="21"/>
         </w:rPr>
@@ -1576,7 +1576,7 @@
           <w:rFonts w:ascii="Calibri" w:cs="Calibri" w:eastAsia="Calibri" w:hAnsi="Calibri"/>
           <w:b/>
           <w:bCs/>
-          <w:color w:val="5B6B4F"/>
+          <w:color w:val="567F4F"/>
           <w:sz w:val="22"/>
           <w:szCs w:val="22"/>
         </w:rPr>
@@ -1595,7 +1595,7 @@
       <w:r>
         <w:rPr>
           <w:rFonts w:ascii="Calibri" w:cs="Calibri" w:eastAsia="Calibri" w:hAnsi="Calibri"/>
-          <w:color w:val="2B2118"/>
+          <w:color w:val="1F2937"/>
           <w:sz w:val="21"/>
           <w:szCs w:val="21"/>
         </w:rPr>
@@ -1614,7 +1614,7 @@
       <w:r>
         <w:rPr>
           <w:rFonts w:ascii="Calibri" w:cs="Calibri" w:eastAsia="Calibri" w:hAnsi="Calibri"/>
-          <w:color w:val="2B2118"/>
+          <w:color w:val="1F2937"/>
           <w:sz w:val="21"/>
           <w:szCs w:val="21"/>
         </w:rPr>
@@ -1633,7 +1633,7 @@
       <w:r>
         <w:rPr>
           <w:rFonts w:ascii="Calibri" w:cs="Calibri" w:eastAsia="Calibri" w:hAnsi="Calibri"/>
-          <w:color w:val="2B2118"/>
+          <w:color w:val="1F2937"/>
           <w:sz w:val="21"/>
           <w:szCs w:val="21"/>
         </w:rPr>
@@ -1644,7 +1644,7 @@
       <w:pPr>
         <w:pStyle w:val="Heading1"/>
         <w:pBdr>
-          <w:bottom w:val="single" w:color="9C4A3C" w:sz="8" w:space="6"/>
+          <w:bottom w:val="single" w:color="B36979" w:sz="8" w:space="6"/>
         </w:pBdr>
         <w:spacing w:after="200" w:before="480"/>
       </w:pPr>
@@ -1653,7 +1653,7 @@
           <w:rFonts w:ascii="Georgia" w:cs="Georgia" w:eastAsia="Georgia" w:hAnsi="Georgia"/>
           <w:b/>
           <w:bCs/>
-          <w:color w:val="9C4A3C"/>
+          <w:color w:val="B36979"/>
           <w:sz w:val="30"/>
           <w:szCs w:val="30"/>
         </w:rPr>
@@ -1670,7 +1670,7 @@
           <w:rFonts w:ascii="Calibri" w:cs="Calibri" w:eastAsia="Calibri" w:hAnsi="Calibri"/>
           <w:b/>
           <w:bCs/>
-          <w:color w:val="5B6B4F"/>
+          <w:color w:val="567F4F"/>
           <w:sz w:val="22"/>
           <w:szCs w:val="22"/>
         </w:rPr>
@@ -1686,7 +1686,7 @@
           <w:rFonts w:ascii="Calibri" w:cs="Calibri" w:eastAsia="Calibri" w:hAnsi="Calibri"/>
           <w:i w:val="false"/>
           <w:iCs w:val="false"/>
-          <w:color w:val="2B2118"/>
+          <w:color w:val="1F2937"/>
           <w:sz w:val="21"/>
           <w:szCs w:val="21"/>
         </w:rPr>
@@ -1713,7 +1713,7 @@
         <w:tc>
           <w:tcPr>
             <w:tcW w:type="dxa" w:w="2400"/>
-            <w:shd w:fill="F7F2EA" w:val="clear"/>
+            <w:shd w:fill="FCFAF9" w:val="clear"/>
             <w:tcMar>
               <w:top w:type="dxa" w:w="100"/>
               <w:left w:type="dxa" w:w="120"/>
@@ -1731,7 +1731,7 @@
                 <w:rFonts w:ascii="Calibri" w:cs="Calibri" w:eastAsia="Calibri" w:hAnsi="Calibri"/>
                 <w:b/>
                 <w:bCs/>
-                <w:color w:val="9C4A3C"/>
+                <w:color w:val="B36979"/>
                 <w:sz w:val="20"/>
                 <w:szCs w:val="20"/>
               </w:rPr>
@@ -1742,7 +1742,7 @@
         <w:tc>
           <w:tcPr>
             <w:tcW w:type="dxa" w:w="7300"/>
-            <w:shd w:fill="F7F2EA" w:val="clear"/>
+            <w:shd w:fill="FCFAF9" w:val="clear"/>
             <w:tcMar>
               <w:top w:type="dxa" w:w="100"/>
               <w:left w:type="dxa" w:w="120"/>
@@ -1760,11 +1760,11 @@
                 <w:rFonts w:ascii="Calibri" w:cs="Calibri" w:eastAsia="Calibri" w:hAnsi="Calibri"/>
                 <w:b w:val="false"/>
                 <w:bCs w:val="false"/>
-                <w:color w:val="2B2118"/>
-                <w:sz w:val="20"/>
-                <w:szCs w:val="20"/>
-              </w:rPr>
-              <w:t xml:space="preserve">Flat 12% on all completed sales, single rate for every seller.</w:t>
+                <w:color w:val="1F2937"/>
+                <w:sz w:val="20"/>
+                <w:szCs w:val="20"/>
+              </w:rPr>
+              <w:t xml:space="preserve">Flat 5% on all completed sales, single rate for every seller — deducted separately from PayMongo's own processing fee, which is not part of Knot &amp; Bloom's revenue.</w:t>
             </w:r>
           </w:p>
         </w:tc>
@@ -1791,7 +1791,7 @@
                 <w:rFonts w:ascii="Calibri" w:cs="Calibri" w:eastAsia="Calibri" w:hAnsi="Calibri"/>
                 <w:b/>
                 <w:bCs/>
-                <w:color w:val="9C4A3C"/>
+                <w:color w:val="B36979"/>
                 <w:sz w:val="20"/>
                 <w:szCs w:val="20"/>
               </w:rPr>
@@ -1820,7 +1820,7 @@
                 <w:rFonts w:ascii="Calibri" w:cs="Calibri" w:eastAsia="Calibri" w:hAnsi="Calibri"/>
                 <w:b w:val="false"/>
                 <w:bCs w:val="false"/>
-                <w:color w:val="2B2118"/>
+                <w:color w:val="1F2937"/>
                 <w:sz w:val="20"/>
                 <w:szCs w:val="20"/>
               </w:rPr>
@@ -1833,7 +1833,7 @@
         <w:tc>
           <w:tcPr>
             <w:tcW w:type="dxa" w:w="2400"/>
-            <w:shd w:fill="F7F2EA" w:val="clear"/>
+            <w:shd w:fill="FCFAF9" w:val="clear"/>
             <w:tcMar>
               <w:top w:type="dxa" w:w="100"/>
               <w:left w:type="dxa" w:w="120"/>
@@ -1851,7 +1851,7 @@
                 <w:rFonts w:ascii="Calibri" w:cs="Calibri" w:eastAsia="Calibri" w:hAnsi="Calibri"/>
                 <w:b/>
                 <w:bCs/>
-                <w:color w:val="9C4A3C"/>
+                <w:color w:val="B36979"/>
                 <w:sz w:val="20"/>
                 <w:szCs w:val="20"/>
               </w:rPr>
@@ -1862,7 +1862,7 @@
         <w:tc>
           <w:tcPr>
             <w:tcW w:type="dxa" w:w="7300"/>
-            <w:shd w:fill="F7F2EA" w:val="clear"/>
+            <w:shd w:fill="FCFAF9" w:val="clear"/>
             <w:tcMar>
               <w:top w:type="dxa" w:w="100"/>
               <w:left w:type="dxa" w:w="120"/>
@@ -1880,7 +1880,7 @@
                 <w:rFonts w:ascii="Calibri" w:cs="Calibri" w:eastAsia="Calibri" w:hAnsi="Calibri"/>
                 <w:b w:val="false"/>
                 <w:bCs w:val="false"/>
-                <w:color w:val="2B2118"/>
+                <w:color w:val="1F2937"/>
                 <w:sz w:val="20"/>
                 <w:szCs w:val="20"/>
               </w:rPr>
@@ -1900,7 +1900,7 @@
           <w:rFonts w:ascii="Calibri" w:cs="Calibri" w:eastAsia="Calibri" w:hAnsi="Calibri"/>
           <w:b/>
           <w:bCs/>
-          <w:color w:val="5B6B4F"/>
+          <w:color w:val="567F4F"/>
           <w:sz w:val="22"/>
           <w:szCs w:val="22"/>
         </w:rPr>
@@ -1916,7 +1916,7 @@
           <w:rFonts w:ascii="Calibri" w:cs="Calibri" w:eastAsia="Calibri" w:hAnsi="Calibri"/>
           <w:i w:val="false"/>
           <w:iCs w:val="false"/>
-          <w:color w:val="2B2118"/>
+          <w:color w:val="1F2937"/>
           <w:sz w:val="21"/>
           <w:szCs w:val="21"/>
         </w:rPr>
@@ -1943,7 +1943,7 @@
         <w:tc>
           <w:tcPr>
             <w:tcW w:type="dxa" w:w="2400"/>
-            <w:shd w:fill="F7F2EA" w:val="clear"/>
+            <w:shd w:fill="FCFAF9" w:val="clear"/>
             <w:tcMar>
               <w:top w:type="dxa" w:w="100"/>
               <w:left w:type="dxa" w:w="120"/>
@@ -1961,7 +1961,7 @@
                 <w:rFonts w:ascii="Calibri" w:cs="Calibri" w:eastAsia="Calibri" w:hAnsi="Calibri"/>
                 <w:b/>
                 <w:bCs/>
-                <w:color w:val="9C4A3C"/>
+                <w:color w:val="B36979"/>
                 <w:sz w:val="20"/>
                 <w:szCs w:val="20"/>
               </w:rPr>
@@ -1972,7 +1972,7 @@
         <w:tc>
           <w:tcPr>
             <w:tcW w:type="dxa" w:w="7300"/>
-            <w:shd w:fill="F7F2EA" w:val="clear"/>
+            <w:shd w:fill="FCFAF9" w:val="clear"/>
             <w:tcMar>
               <w:top w:type="dxa" w:w="100"/>
               <w:left w:type="dxa" w:w="120"/>
@@ -1990,7 +1990,7 @@
                 <w:rFonts w:ascii="Calibri" w:cs="Calibri" w:eastAsia="Calibri" w:hAnsi="Calibri"/>
                 <w:b w:val="false"/>
                 <w:bCs w:val="false"/>
-                <w:color w:val="2B2118"/>
+                <w:color w:val="1F2937"/>
                 <w:sz w:val="20"/>
                 <w:szCs w:val="20"/>
               </w:rPr>
@@ -2021,7 +2021,7 @@
                 <w:rFonts w:ascii="Calibri" w:cs="Calibri" w:eastAsia="Calibri" w:hAnsi="Calibri"/>
                 <w:b/>
                 <w:bCs/>
-                <w:color w:val="9C4A3C"/>
+                <w:color w:val="B36979"/>
                 <w:sz w:val="20"/>
                 <w:szCs w:val="20"/>
               </w:rPr>
@@ -2050,7 +2050,7 @@
                 <w:rFonts w:ascii="Calibri" w:cs="Calibri" w:eastAsia="Calibri" w:hAnsi="Calibri"/>
                 <w:b w:val="false"/>
                 <w:bCs w:val="false"/>
-                <w:color w:val="2B2118"/>
+                <w:color w:val="1F2937"/>
                 <w:sz w:val="20"/>
                 <w:szCs w:val="20"/>
               </w:rPr>
@@ -2063,7 +2063,7 @@
         <w:tc>
           <w:tcPr>
             <w:tcW w:type="dxa" w:w="2400"/>
-            <w:shd w:fill="F7F2EA" w:val="clear"/>
+            <w:shd w:fill="FCFAF9" w:val="clear"/>
             <w:tcMar>
               <w:top w:type="dxa" w:w="100"/>
               <w:left w:type="dxa" w:w="120"/>
@@ -2081,7 +2081,7 @@
                 <w:rFonts w:ascii="Calibri" w:cs="Calibri" w:eastAsia="Calibri" w:hAnsi="Calibri"/>
                 <w:b/>
                 <w:bCs/>
-                <w:color w:val="9C4A3C"/>
+                <w:color w:val="B36979"/>
                 <w:sz w:val="20"/>
                 <w:szCs w:val="20"/>
               </w:rPr>
@@ -2092,7 +2092,7 @@
         <w:tc>
           <w:tcPr>
             <w:tcW w:type="dxa" w:w="7300"/>
-            <w:shd w:fill="F7F2EA" w:val="clear"/>
+            <w:shd w:fill="FCFAF9" w:val="clear"/>
             <w:tcMar>
               <w:top w:type="dxa" w:w="100"/>
               <w:left w:type="dxa" w:w="120"/>
@@ -2110,7 +2110,7 @@
                 <w:rFonts w:ascii="Calibri" w:cs="Calibri" w:eastAsia="Calibri" w:hAnsi="Calibri"/>
                 <w:b w:val="false"/>
                 <w:bCs w:val="false"/>
-                <w:color w:val="2B2118"/>
+                <w:color w:val="1F2937"/>
                 <w:sz w:val="20"/>
                 <w:szCs w:val="20"/>
               </w:rPr>
@@ -2130,7 +2130,7 @@
           <w:rFonts w:ascii="Calibri" w:cs="Calibri" w:eastAsia="Calibri" w:hAnsi="Calibri"/>
           <w:b/>
           <w:bCs/>
-          <w:color w:val="5B6B4F"/>
+          <w:color w:val="567F4F"/>
           <w:sz w:val="22"/>
           <w:szCs w:val="22"/>
         </w:rPr>
@@ -2146,7 +2146,7 @@
           <w:rFonts w:ascii="Calibri" w:cs="Calibri" w:eastAsia="Calibri" w:hAnsi="Calibri"/>
           <w:i w:val="false"/>
           <w:iCs w:val="false"/>
-          <w:color w:val="2B2118"/>
+          <w:color w:val="1F2937"/>
           <w:sz w:val="21"/>
           <w:szCs w:val="21"/>
         </w:rPr>
@@ -2162,7 +2162,7 @@
       <w:pPr>
         <w:pStyle w:val="Heading1"/>
         <w:pBdr>
-          <w:bottom w:val="single" w:color="9C4A3C" w:sz="8" w:space="6"/>
+          <w:bottom w:val="single" w:color="B36979" w:sz="8" w:space="6"/>
         </w:pBdr>
         <w:spacing w:after="200" w:before="480"/>
       </w:pPr>
@@ -2171,7 +2171,7 @@
           <w:rFonts w:ascii="Georgia" w:cs="Georgia" w:eastAsia="Georgia" w:hAnsi="Georgia"/>
           <w:b/>
           <w:bCs/>
-          <w:color w:val="9C4A3C"/>
+          <w:color w:val="B36979"/>
           <w:sz w:val="30"/>
           <w:szCs w:val="30"/>
         </w:rPr>
@@ -2188,7 +2188,7 @@
           <w:rFonts w:ascii="Calibri" w:cs="Calibri" w:eastAsia="Calibri" w:hAnsi="Calibri"/>
           <w:b/>
           <w:bCs/>
-          <w:color w:val="5B6B4F"/>
+          <w:color w:val="567F4F"/>
           <w:sz w:val="22"/>
           <w:szCs w:val="22"/>
         </w:rPr>
@@ -2207,7 +2207,7 @@
       <w:r>
         <w:rPr>
           <w:rFonts w:ascii="Calibri" w:cs="Calibri" w:eastAsia="Calibri" w:hAnsi="Calibri"/>
-          <w:color w:val="2B2118"/>
+          <w:color w:val="1F2937"/>
           <w:sz w:val="21"/>
           <w:szCs w:val="21"/>
         </w:rPr>
@@ -2226,7 +2226,7 @@
       <w:r>
         <w:rPr>
           <w:rFonts w:ascii="Calibri" w:cs="Calibri" w:eastAsia="Calibri" w:hAnsi="Calibri"/>
-          <w:color w:val="2B2118"/>
+          <w:color w:val="1F2937"/>
           <w:sz w:val="21"/>
           <w:szCs w:val="21"/>
         </w:rPr>
@@ -2245,7 +2245,7 @@
       <w:r>
         <w:rPr>
           <w:rFonts w:ascii="Calibri" w:cs="Calibri" w:eastAsia="Calibri" w:hAnsi="Calibri"/>
-          <w:color w:val="2B2118"/>
+          <w:color w:val="1F2937"/>
           <w:sz w:val="21"/>
           <w:szCs w:val="21"/>
         </w:rPr>
@@ -2264,7 +2264,7 @@
       <w:r>
         <w:rPr>
           <w:rFonts w:ascii="Calibri" w:cs="Calibri" w:eastAsia="Calibri" w:hAnsi="Calibri"/>
-          <w:color w:val="2B2118"/>
+          <w:color w:val="1F2937"/>
           <w:sz w:val="21"/>
           <w:szCs w:val="21"/>
         </w:rPr>
@@ -2281,7 +2281,7 @@
           <w:rFonts w:ascii="Calibri" w:cs="Calibri" w:eastAsia="Calibri" w:hAnsi="Calibri"/>
           <w:b/>
           <w:bCs/>
-          <w:color w:val="5B6B4F"/>
+          <w:color w:val="567F4F"/>
           <w:sz w:val="22"/>
           <w:szCs w:val="22"/>
         </w:rPr>
@@ -2300,7 +2300,7 @@
       <w:r>
         <w:rPr>
           <w:rFonts w:ascii="Calibri" w:cs="Calibri" w:eastAsia="Calibri" w:hAnsi="Calibri"/>
-          <w:color w:val="2B2118"/>
+          <w:color w:val="1F2937"/>
           <w:sz w:val="21"/>
           <w:szCs w:val="21"/>
         </w:rPr>
@@ -2319,7 +2319,7 @@
       <w:r>
         <w:rPr>
           <w:rFonts w:ascii="Calibri" w:cs="Calibri" w:eastAsia="Calibri" w:hAnsi="Calibri"/>
-          <w:color w:val="2B2118"/>
+          <w:color w:val="1F2937"/>
           <w:sz w:val="21"/>
           <w:szCs w:val="21"/>
         </w:rPr>
@@ -2329,9 +2329,9 @@
     <w:p>
       <w:pPr>
         <w:pBdr>
-          <w:left w:val="single" w:color="9C4A3C" w:sz="24" w:space="8"/>
+          <w:left w:val="single" w:color="B36979" w:sz="24" w:space="8"/>
         </w:pBdr>
-        <w:shd w:fill="F1E3DF" w:val="clear"/>
+        <w:shd w:fill="E8D5D9" w:val="clear"/>
         <w:spacing w:after="160" w:before="100" w:line="276"/>
         <w:ind w:left="200"/>
       </w:pPr>
@@ -2340,7 +2340,7 @@
           <w:rFonts w:ascii="Calibri" w:cs="Calibri" w:eastAsia="Calibri" w:hAnsi="Calibri"/>
           <w:b/>
           <w:bCs/>
-          <w:color w:val="9C4A3C"/>
+          <w:color w:val="B36979"/>
           <w:sz w:val="19"/>
           <w:szCs w:val="19"/>
         </w:rPr>
@@ -2351,7 +2351,7 @@
           <w:rFonts w:ascii="Calibri" w:cs="Calibri" w:eastAsia="Calibri" w:hAnsi="Calibri"/>
           <w:i/>
           <w:iCs/>
-          <w:color w:val="2B2118"/>
+          <w:color w:val="1F2937"/>
           <w:sz w:val="20"/>
           <w:szCs w:val="20"/>
         </w:rPr>
@@ -2362,7 +2362,7 @@
       <w:pPr>
         <w:pStyle w:val="Heading1"/>
         <w:pBdr>
-          <w:bottom w:val="single" w:color="9C4A3C" w:sz="8" w:space="6"/>
+          <w:bottom w:val="single" w:color="B36979" w:sz="8" w:space="6"/>
         </w:pBdr>
         <w:spacing w:after="200" w:before="480"/>
       </w:pPr>
@@ -2371,7 +2371,7 @@
           <w:rFonts w:ascii="Georgia" w:cs="Georgia" w:eastAsia="Georgia" w:hAnsi="Georgia"/>
           <w:b/>
           <w:bCs/>
-          <w:color w:val="9C4A3C"/>
+          <w:color w:val="B36979"/>
           <w:sz w:val="30"/>
           <w:szCs w:val="30"/>
         </w:rPr>
@@ -2398,7 +2398,7 @@
         <w:tc>
           <w:tcPr>
             <w:tcW w:type="dxa" w:w="2400"/>
-            <w:shd w:fill="F7F2EA" w:val="clear"/>
+            <w:shd w:fill="FCFAF9" w:val="clear"/>
             <w:tcMar>
               <w:top w:type="dxa" w:w="100"/>
               <w:left w:type="dxa" w:w="120"/>
@@ -2416,7 +2416,7 @@
                 <w:rFonts w:ascii="Calibri" w:cs="Calibri" w:eastAsia="Calibri" w:hAnsi="Calibri"/>
                 <w:b/>
                 <w:bCs/>
-                <w:color w:val="9C4A3C"/>
+                <w:color w:val="B36979"/>
                 <w:sz w:val="20"/>
                 <w:szCs w:val="20"/>
               </w:rPr>
@@ -2427,7 +2427,7 @@
         <w:tc>
           <w:tcPr>
             <w:tcW w:type="dxa" w:w="7300"/>
-            <w:shd w:fill="F7F2EA" w:val="clear"/>
+            <w:shd w:fill="FCFAF9" w:val="clear"/>
             <w:tcMar>
               <w:top w:type="dxa" w:w="100"/>
               <w:left w:type="dxa" w:w="120"/>
@@ -2445,7 +2445,7 @@
                 <w:rFonts w:ascii="Calibri" w:cs="Calibri" w:eastAsia="Calibri" w:hAnsi="Calibri"/>
                 <w:b w:val="false"/>
                 <w:bCs w:val="false"/>
-                <w:color w:val="2B2118"/>
+                <w:color w:val="1F2937"/>
                 <w:sz w:val="20"/>
                 <w:szCs w:val="20"/>
               </w:rPr>
@@ -2476,7 +2476,7 @@
                 <w:rFonts w:ascii="Calibri" w:cs="Calibri" w:eastAsia="Calibri" w:hAnsi="Calibri"/>
                 <w:b/>
                 <w:bCs/>
-                <w:color w:val="9C4A3C"/>
+                <w:color w:val="B36979"/>
                 <w:sz w:val="20"/>
                 <w:szCs w:val="20"/>
               </w:rPr>
@@ -2505,7 +2505,7 @@
                 <w:rFonts w:ascii="Calibri" w:cs="Calibri" w:eastAsia="Calibri" w:hAnsi="Calibri"/>
                 <w:b w:val="false"/>
                 <w:bCs w:val="false"/>
-                <w:color w:val="2B2118"/>
+                <w:color w:val="1F2937"/>
                 <w:sz w:val="20"/>
                 <w:szCs w:val="20"/>
               </w:rPr>
@@ -2518,7 +2518,7 @@
         <w:tc>
           <w:tcPr>
             <w:tcW w:type="dxa" w:w="2400"/>
-            <w:shd w:fill="F7F2EA" w:val="clear"/>
+            <w:shd w:fill="FCFAF9" w:val="clear"/>
             <w:tcMar>
               <w:top w:type="dxa" w:w="100"/>
               <w:left w:type="dxa" w:w="120"/>
@@ -2536,7 +2536,7 @@
                 <w:rFonts w:ascii="Calibri" w:cs="Calibri" w:eastAsia="Calibri" w:hAnsi="Calibri"/>
                 <w:b/>
                 <w:bCs/>
-                <w:color w:val="9C4A3C"/>
+                <w:color w:val="B36979"/>
                 <w:sz w:val="20"/>
                 <w:szCs w:val="20"/>
               </w:rPr>
@@ -2547,7 +2547,7 @@
         <w:tc>
           <w:tcPr>
             <w:tcW w:type="dxa" w:w="7300"/>
-            <w:shd w:fill="F7F2EA" w:val="clear"/>
+            <w:shd w:fill="FCFAF9" w:val="clear"/>
             <w:tcMar>
               <w:top w:type="dxa" w:w="100"/>
               <w:left w:type="dxa" w:w="120"/>
@@ -2565,7 +2565,7 @@
                 <w:rFonts w:ascii="Calibri" w:cs="Calibri" w:eastAsia="Calibri" w:hAnsi="Calibri"/>
                 <w:b w:val="false"/>
                 <w:bCs w:val="false"/>
-                <w:color w:val="2B2118"/>
+                <w:color w:val="1F2937"/>
                 <w:sz w:val="20"/>
                 <w:szCs w:val="20"/>
               </w:rPr>
@@ -2579,7 +2579,7 @@
       <w:pPr>
         <w:pStyle w:val="Heading1"/>
         <w:pBdr>
-          <w:bottom w:val="single" w:color="9C4A3C" w:sz="8" w:space="6"/>
+          <w:bottom w:val="single" w:color="B36979" w:sz="8" w:space="6"/>
         </w:pBdr>
         <w:spacing w:after="200" w:before="480"/>
       </w:pPr>
@@ -2588,7 +2588,7 @@
           <w:rFonts w:ascii="Georgia" w:cs="Georgia" w:eastAsia="Georgia" w:hAnsi="Georgia"/>
           <w:b/>
           <w:bCs/>
-          <w:color w:val="9C4A3C"/>
+          <w:color w:val="B36979"/>
           <w:sz w:val="30"/>
           <w:szCs w:val="30"/>
         </w:rPr>
@@ -2607,7 +2607,7 @@
       <w:r>
         <w:rPr>
           <w:rFonts w:ascii="Calibri" w:cs="Calibri" w:eastAsia="Calibri" w:hAnsi="Calibri"/>
-          <w:color w:val="2B2118"/>
+          <w:color w:val="1F2937"/>
           <w:sz w:val="21"/>
           <w:szCs w:val="21"/>
         </w:rPr>
@@ -2626,7 +2626,7 @@
       <w:r>
         <w:rPr>
           <w:rFonts w:ascii="Calibri" w:cs="Calibri" w:eastAsia="Calibri" w:hAnsi="Calibri"/>
-          <w:color w:val="2B2118"/>
+          <w:color w:val="1F2937"/>
           <w:sz w:val="21"/>
           <w:szCs w:val="21"/>
         </w:rPr>
@@ -2645,7 +2645,7 @@
       <w:r>
         <w:rPr>
           <w:rFonts w:ascii="Calibri" w:cs="Calibri" w:eastAsia="Calibri" w:hAnsi="Calibri"/>
-          <w:color w:val="2B2118"/>
+          <w:color w:val="1F2937"/>
           <w:sz w:val="21"/>
           <w:szCs w:val="21"/>
         </w:rPr>
@@ -2664,7 +2664,7 @@
       <w:r>
         <w:rPr>
           <w:rFonts w:ascii="Calibri" w:cs="Calibri" w:eastAsia="Calibri" w:hAnsi="Calibri"/>
-          <w:color w:val="2B2118"/>
+          <w:color w:val="1F2937"/>
           <w:sz w:val="21"/>
           <w:szCs w:val="21"/>
         </w:rPr>
@@ -2683,7 +2683,7 @@
       <w:r>
         <w:rPr>
           <w:rFonts w:ascii="Calibri" w:cs="Calibri" w:eastAsia="Calibri" w:hAnsi="Calibri"/>
-          <w:color w:val="2B2118"/>
+          <w:color w:val="1F2937"/>
           <w:sz w:val="21"/>
           <w:szCs w:val="21"/>
         </w:rPr>
@@ -2702,7 +2702,7 @@
       <w:r>
         <w:rPr>
           <w:rFonts w:ascii="Calibri" w:cs="Calibri" w:eastAsia="Calibri" w:hAnsi="Calibri"/>
-          <w:color w:val="2B2118"/>
+          <w:color w:val="1F2937"/>
           <w:sz w:val="21"/>
           <w:szCs w:val="21"/>
         </w:rPr>
@@ -2721,7 +2721,7 @@
       <w:r>
         <w:rPr>
           <w:rFonts w:ascii="Calibri" w:cs="Calibri" w:eastAsia="Calibri" w:hAnsi="Calibri"/>
-          <w:color w:val="2B2118"/>
+          <w:color w:val="1F2937"/>
           <w:sz w:val="21"/>
           <w:szCs w:val="21"/>
         </w:rPr>
@@ -2740,7 +2740,7 @@
       <w:r>
         <w:rPr>
           <w:rFonts w:ascii="Calibri" w:cs="Calibri" w:eastAsia="Calibri" w:hAnsi="Calibri"/>
-          <w:color w:val="2B2118"/>
+          <w:color w:val="1F2937"/>
           <w:sz w:val="21"/>
           <w:szCs w:val="21"/>
         </w:rPr>
@@ -2751,7 +2751,7 @@
       <w:pPr>
         <w:pStyle w:val="Heading1"/>
         <w:pBdr>
-          <w:bottom w:val="single" w:color="9C4A3C" w:sz="8" w:space="6"/>
+          <w:bottom w:val="single" w:color="B36979" w:sz="8" w:space="6"/>
         </w:pBdr>
         <w:spacing w:after="200" w:before="480"/>
       </w:pPr>
@@ -2760,7 +2760,7 @@
           <w:rFonts w:ascii="Georgia" w:cs="Georgia" w:eastAsia="Georgia" w:hAnsi="Georgia"/>
           <w:b/>
           <w:bCs/>
-          <w:color w:val="9C4A3C"/>
+          <w:color w:val="B36979"/>
           <w:sz w:val="30"/>
           <w:szCs w:val="30"/>
         </w:rPr>
@@ -2779,7 +2779,7 @@
       <w:r>
         <w:rPr>
           <w:rFonts w:ascii="Calibri" w:cs="Calibri" w:eastAsia="Calibri" w:hAnsi="Calibri"/>
-          <w:color w:val="2B2118"/>
+          <w:color w:val="1F2937"/>
           <w:sz w:val="21"/>
           <w:szCs w:val="21"/>
         </w:rPr>
@@ -2798,7 +2798,7 @@
       <w:r>
         <w:rPr>
           <w:rFonts w:ascii="Calibri" w:cs="Calibri" w:eastAsia="Calibri" w:hAnsi="Calibri"/>
-          <w:color w:val="2B2118"/>
+          <w:color w:val="1F2937"/>
           <w:sz w:val="21"/>
           <w:szCs w:val="21"/>
         </w:rPr>
@@ -2817,7 +2817,7 @@
       <w:r>
         <w:rPr>
           <w:rFonts w:ascii="Calibri" w:cs="Calibri" w:eastAsia="Calibri" w:hAnsi="Calibri"/>
-          <w:color w:val="2B2118"/>
+          <w:color w:val="1F2937"/>
           <w:sz w:val="21"/>
           <w:szCs w:val="21"/>
         </w:rPr>
@@ -2836,7 +2836,7 @@
       <w:r>
         <w:rPr>
           <w:rFonts w:ascii="Calibri" w:cs="Calibri" w:eastAsia="Calibri" w:hAnsi="Calibri"/>
-          <w:color w:val="2B2118"/>
+          <w:color w:val="1F2937"/>
           <w:sz w:val="21"/>
           <w:szCs w:val="21"/>
         </w:rPr>
@@ -2855,7 +2855,7 @@
       <w:r>
         <w:rPr>
           <w:rFonts w:ascii="Calibri" w:cs="Calibri" w:eastAsia="Calibri" w:hAnsi="Calibri"/>
-          <w:color w:val="2B2118"/>
+          <w:color w:val="1F2937"/>
           <w:sz w:val="21"/>
           <w:szCs w:val="21"/>
         </w:rPr>
@@ -2874,7 +2874,7 @@
       <w:r>
         <w:rPr>
           <w:rFonts w:ascii="Calibri" w:cs="Calibri" w:eastAsia="Calibri" w:hAnsi="Calibri"/>
-          <w:color w:val="2B2118"/>
+          <w:color w:val="1F2937"/>
           <w:sz w:val="21"/>
           <w:szCs w:val="21"/>
         </w:rPr>
@@ -2890,7 +2890,7 @@
       <w:pPr>
         <w:pStyle w:val="Heading1"/>
         <w:pBdr>
-          <w:bottom w:val="single" w:color="9C4A3C" w:sz="8" w:space="6"/>
+          <w:bottom w:val="single" w:color="B36979" w:sz="8" w:space="6"/>
         </w:pBdr>
         <w:spacing w:after="200" w:before="480"/>
       </w:pPr>
@@ -2899,7 +2899,7 @@
           <w:rFonts w:ascii="Georgia" w:cs="Georgia" w:eastAsia="Georgia" w:hAnsi="Georgia"/>
           <w:b/>
           <w:bCs/>
-          <w:color w:val="9C4A3C"/>
+          <w:color w:val="B36979"/>
           <w:sz w:val="30"/>
           <w:szCs w:val="30"/>
         </w:rPr>
@@ -2926,7 +2926,7 @@
         <w:tc>
           <w:tcPr>
             <w:tcW w:type="dxa" w:w="2400"/>
-            <w:shd w:fill="F7F2EA" w:val="clear"/>
+            <w:shd w:fill="FCFAF9" w:val="clear"/>
             <w:tcMar>
               <w:top w:type="dxa" w:w="100"/>
               <w:left w:type="dxa" w:w="120"/>
@@ -2944,7 +2944,7 @@
                 <w:rFonts w:ascii="Calibri" w:cs="Calibri" w:eastAsia="Calibri" w:hAnsi="Calibri"/>
                 <w:b/>
                 <w:bCs/>
-                <w:color w:val="9C4A3C"/>
+                <w:color w:val="B36979"/>
                 <w:sz w:val="20"/>
                 <w:szCs w:val="20"/>
               </w:rPr>
@@ -2955,7 +2955,7 @@
         <w:tc>
           <w:tcPr>
             <w:tcW w:type="dxa" w:w="7300"/>
-            <w:shd w:fill="F7F2EA" w:val="clear"/>
+            <w:shd w:fill="FCFAF9" w:val="clear"/>
             <w:tcMar>
               <w:top w:type="dxa" w:w="100"/>
               <w:left w:type="dxa" w:w="120"/>
@@ -2973,11 +2973,11 @@
                 <w:rFonts w:ascii="Calibri" w:cs="Calibri" w:eastAsia="Calibri" w:hAnsi="Calibri"/>
                 <w:b w:val="false"/>
                 <w:bCs w:val="false"/>
-                <w:color w:val="2B2118"/>
-                <w:sz w:val="20"/>
-                <w:szCs w:val="20"/>
-              </w:rPr>
-              <w:t xml:space="preserve">Core dependency — every commission, deposit, and payout runs through it. Actively monitored, not treated as a plug-and-play vendor.</w:t>
+                <w:color w:val="1F2937"/>
+                <w:sz w:val="20"/>
+                <w:szCs w:val="20"/>
+              </w:rPr>
+              <w:t xml:space="preserve">Core dependency — every commission, deposit, and payout runs through it, and it deducts its own processing fee from each transaction before payout. Actively monitored, not treated as a plug-and-play vendor.</w:t>
             </w:r>
           </w:p>
         </w:tc>
@@ -3004,7 +3004,7 @@
                 <w:rFonts w:ascii="Calibri" w:cs="Calibri" w:eastAsia="Calibri" w:hAnsi="Calibri"/>
                 <w:b/>
                 <w:bCs/>
-                <w:color w:val="9C4A3C"/>
+                <w:color w:val="B36979"/>
                 <w:sz w:val="20"/>
                 <w:szCs w:val="20"/>
               </w:rPr>
@@ -3033,7 +3033,7 @@
                 <w:rFonts w:ascii="Calibri" w:cs="Calibri" w:eastAsia="Calibri" w:hAnsi="Calibri"/>
                 <w:b w:val="false"/>
                 <w:bCs w:val="false"/>
-                <w:color w:val="2B2118"/>
+                <w:color w:val="1F2937"/>
                 <w:sz w:val="20"/>
                 <w:szCs w:val="20"/>
               </w:rPr>
@@ -3046,7 +3046,7 @@
         <w:tc>
           <w:tcPr>
             <w:tcW w:type="dxa" w:w="2400"/>
-            <w:shd w:fill="F7F2EA" w:val="clear"/>
+            <w:shd w:fill="FCFAF9" w:val="clear"/>
             <w:tcMar>
               <w:top w:type="dxa" w:w="100"/>
               <w:left w:type="dxa" w:w="120"/>
@@ -3064,7 +3064,7 @@
                 <w:rFonts w:ascii="Calibri" w:cs="Calibri" w:eastAsia="Calibri" w:hAnsi="Calibri"/>
                 <w:b/>
                 <w:bCs/>
-                <w:color w:val="9C4A3C"/>
+                <w:color w:val="B36979"/>
                 <w:sz w:val="20"/>
                 <w:szCs w:val="20"/>
               </w:rPr>
@@ -3075,7 +3075,7 @@
         <w:tc>
           <w:tcPr>
             <w:tcW w:type="dxa" w:w="7300"/>
-            <w:shd w:fill="F7F2EA" w:val="clear"/>
+            <w:shd w:fill="FCFAF9" w:val="clear"/>
             <w:tcMar>
               <w:top w:type="dxa" w:w="100"/>
               <w:left w:type="dxa" w:w="120"/>
@@ -3093,7 +3093,7 @@
                 <w:rFonts w:ascii="Calibri" w:cs="Calibri" w:eastAsia="Calibri" w:hAnsi="Calibri"/>
                 <w:b w:val="false"/>
                 <w:bCs w:val="false"/>
-                <w:color w:val="2B2118"/>
+                <w:color w:val="1F2937"/>
                 <w:sz w:val="20"/>
                 <w:szCs w:val="20"/>
               </w:rPr>
@@ -3124,7 +3124,7 @@
                 <w:rFonts w:ascii="Calibri" w:cs="Calibri" w:eastAsia="Calibri" w:hAnsi="Calibri"/>
                 <w:b/>
                 <w:bCs/>
-                <w:color w:val="9C4A3C"/>
+                <w:color w:val="B36979"/>
                 <w:sz w:val="20"/>
                 <w:szCs w:val="20"/>
               </w:rPr>
@@ -3153,7 +3153,7 @@
                 <w:rFonts w:ascii="Calibri" w:cs="Calibri" w:eastAsia="Calibri" w:hAnsi="Calibri"/>
                 <w:b w:val="false"/>
                 <w:bCs w:val="false"/>
-                <w:color w:val="2B2118"/>
+                <w:color w:val="1F2937"/>
                 <w:sz w:val="20"/>
                 <w:szCs w:val="20"/>
               </w:rPr>
@@ -3172,7 +3172,7 @@
           <w:rFonts w:ascii="Calibri" w:cs="Calibri" w:eastAsia="Calibri" w:hAnsi="Calibri"/>
           <w:i w:val="false"/>
           <w:iCs w:val="false"/>
-          <w:color w:val="2B2118"/>
+          <w:color w:val="1F2937"/>
           <w:sz w:val="21"/>
           <w:szCs w:val="21"/>
         </w:rPr>
@@ -3183,7 +3183,7 @@
       <w:pPr>
         <w:pStyle w:val="Heading1"/>
         <w:pBdr>
-          <w:bottom w:val="single" w:color="9C4A3C" w:sz="8" w:space="6"/>
+          <w:bottom w:val="single" w:color="B36979" w:sz="8" w:space="6"/>
         </w:pBdr>
         <w:spacing w:after="200" w:before="480"/>
       </w:pPr>
@@ -3192,7 +3192,7 @@
           <w:rFonts w:ascii="Georgia" w:cs="Georgia" w:eastAsia="Georgia" w:hAnsi="Georgia"/>
           <w:b/>
           <w:bCs/>
-          <w:color w:val="9C4A3C"/>
+          <w:color w:val="B36979"/>
           <w:sz w:val="30"/>
           <w:szCs w:val="30"/>
         </w:rPr>
@@ -3209,7 +3209,7 @@
           <w:rFonts w:ascii="Calibri" w:cs="Calibri" w:eastAsia="Calibri" w:hAnsi="Calibri"/>
           <w:b/>
           <w:bCs/>
-          <w:color w:val="5B6B4F"/>
+          <w:color w:val="567F4F"/>
           <w:sz w:val="22"/>
           <w:szCs w:val="22"/>
         </w:rPr>
@@ -3236,7 +3236,7 @@
         <w:tc>
           <w:tcPr>
             <w:tcW w:type="dxa" w:w="2400"/>
-            <w:shd w:fill="F7F2EA" w:val="clear"/>
+            <w:shd w:fill="FCFAF9" w:val="clear"/>
             <w:tcMar>
               <w:top w:type="dxa" w:w="100"/>
               <w:left w:type="dxa" w:w="120"/>
@@ -3254,7 +3254,7 @@
                 <w:rFonts w:ascii="Calibri" w:cs="Calibri" w:eastAsia="Calibri" w:hAnsi="Calibri"/>
                 <w:b/>
                 <w:bCs/>
-                <w:color w:val="9C4A3C"/>
+                <w:color w:val="B36979"/>
                 <w:sz w:val="20"/>
                 <w:szCs w:val="20"/>
               </w:rPr>
@@ -3265,7 +3265,7 @@
         <w:tc>
           <w:tcPr>
             <w:tcW w:type="dxa" w:w="7300"/>
-            <w:shd w:fill="F7F2EA" w:val="clear"/>
+            <w:shd w:fill="FCFAF9" w:val="clear"/>
             <w:tcMar>
               <w:top w:type="dxa" w:w="100"/>
               <w:left w:type="dxa" w:w="120"/>
@@ -3283,7 +3283,7 @@
                 <w:rFonts w:ascii="Calibri" w:cs="Calibri" w:eastAsia="Calibri" w:hAnsi="Calibri"/>
                 <w:b w:val="false"/>
                 <w:bCs w:val="false"/>
-                <w:color w:val="2B2118"/>
+                <w:color w:val="1F2937"/>
                 <w:sz w:val="20"/>
                 <w:szCs w:val="20"/>
               </w:rPr>
@@ -3314,7 +3314,7 @@
                 <w:rFonts w:ascii="Calibri" w:cs="Calibri" w:eastAsia="Calibri" w:hAnsi="Calibri"/>
                 <w:b/>
                 <w:bCs/>
-                <w:color w:val="9C4A3C"/>
+                <w:color w:val="B36979"/>
                 <w:sz w:val="20"/>
                 <w:szCs w:val="20"/>
               </w:rPr>
@@ -3343,7 +3343,7 @@
                 <w:rFonts w:ascii="Calibri" w:cs="Calibri" w:eastAsia="Calibri" w:hAnsi="Calibri"/>
                 <w:b w:val="false"/>
                 <w:bCs w:val="false"/>
-                <w:color w:val="2B2118"/>
+                <w:color w:val="1F2937"/>
                 <w:sz w:val="20"/>
                 <w:szCs w:val="20"/>
               </w:rPr>
@@ -3356,7 +3356,7 @@
         <w:tc>
           <w:tcPr>
             <w:tcW w:type="dxa" w:w="2400"/>
-            <w:shd w:fill="F7F2EA" w:val="clear"/>
+            <w:shd w:fill="FCFAF9" w:val="clear"/>
             <w:tcMar>
               <w:top w:type="dxa" w:w="100"/>
               <w:left w:type="dxa" w:w="120"/>
@@ -3374,7 +3374,7 @@
                 <w:rFonts w:ascii="Calibri" w:cs="Calibri" w:eastAsia="Calibri" w:hAnsi="Calibri"/>
                 <w:b/>
                 <w:bCs/>
-                <w:color w:val="9C4A3C"/>
+                <w:color w:val="B36979"/>
                 <w:sz w:val="20"/>
                 <w:szCs w:val="20"/>
               </w:rPr>
@@ -3385,7 +3385,7 @@
         <w:tc>
           <w:tcPr>
             <w:tcW w:type="dxa" w:w="7300"/>
-            <w:shd w:fill="F7F2EA" w:val="clear"/>
+            <w:shd w:fill="FCFAF9" w:val="clear"/>
             <w:tcMar>
               <w:top w:type="dxa" w:w="100"/>
               <w:left w:type="dxa" w:w="120"/>
@@ -3403,7 +3403,7 @@
                 <w:rFonts w:ascii="Calibri" w:cs="Calibri" w:eastAsia="Calibri" w:hAnsi="Calibri"/>
                 <w:b w:val="false"/>
                 <w:bCs w:val="false"/>
-                <w:color w:val="2B2118"/>
+                <w:color w:val="1F2937"/>
                 <w:sz w:val="20"/>
                 <w:szCs w:val="20"/>
               </w:rPr>
@@ -3434,7 +3434,7 @@
                 <w:rFonts w:ascii="Calibri" w:cs="Calibri" w:eastAsia="Calibri" w:hAnsi="Calibri"/>
                 <w:b/>
                 <w:bCs/>
-                <w:color w:val="9C4A3C"/>
+                <w:color w:val="B36979"/>
                 <w:sz w:val="20"/>
                 <w:szCs w:val="20"/>
               </w:rPr>
@@ -3463,7 +3463,7 @@
                 <w:rFonts w:ascii="Calibri" w:cs="Calibri" w:eastAsia="Calibri" w:hAnsi="Calibri"/>
                 <w:b w:val="false"/>
                 <w:bCs w:val="false"/>
-                <w:color w:val="2B2118"/>
+                <w:color w:val="1F2937"/>
                 <w:sz w:val="20"/>
                 <w:szCs w:val="20"/>
               </w:rPr>
@@ -3476,9 +3476,9 @@
     <w:p>
       <w:pPr>
         <w:pBdr>
-          <w:left w:val="single" w:color="9C4A3C" w:sz="24" w:space="8"/>
+          <w:left w:val="single" w:color="B36979" w:sz="24" w:space="8"/>
         </w:pBdr>
-        <w:shd w:fill="F1E3DF" w:val="clear"/>
+        <w:shd w:fill="E8D5D9" w:val="clear"/>
         <w:spacing w:after="160" w:before="100" w:line="276"/>
         <w:ind w:left="200"/>
       </w:pPr>
@@ -3487,7 +3487,7 @@
           <w:rFonts w:ascii="Calibri" w:cs="Calibri" w:eastAsia="Calibri" w:hAnsi="Calibri"/>
           <w:b/>
           <w:bCs/>
-          <w:color w:val="9C4A3C"/>
+          <w:color w:val="B36979"/>
           <w:sz w:val="19"/>
           <w:szCs w:val="19"/>
         </w:rPr>
@@ -3498,7 +3498,7 @@
           <w:rFonts w:ascii="Calibri" w:cs="Calibri" w:eastAsia="Calibri" w:hAnsi="Calibri"/>
           <w:i/>
           <w:iCs/>
-          <w:color w:val="2B2118"/>
+          <w:color w:val="1F2937"/>
           <w:sz w:val="20"/>
           <w:szCs w:val="20"/>
         </w:rPr>
@@ -3507,9 +3507,41 @@
     </w:p>
     <w:p>
       <w:pPr>
+        <w:pBdr>
+          <w:left w:val="single" w:color="B36979" w:sz="24" w:space="8"/>
+        </w:pBdr>
+        <w:shd w:fill="E8D5D9" w:val="clear"/>
+        <w:spacing w:after="160" w:before="100" w:line="276"/>
+        <w:ind w:left="200"/>
+      </w:pPr>
+      <w:r>
+        <w:rPr>
+          <w:rFonts w:ascii="Calibri" w:cs="Calibri" w:eastAsia="Calibri" w:hAnsi="Calibri"/>
+          <w:b/>
+          <w:bCs/>
+          <w:color w:val="B36979"/>
+          <w:sz w:val="19"/>
+          <w:szCs w:val="19"/>
+        </w:rPr>
+        <w:t xml:space="preserve">NOTE  </w:t>
+      </w:r>
+      <w:r>
+        <w:rPr>
+          <w:rFonts w:ascii="Calibri" w:cs="Calibri" w:eastAsia="Calibri" w:hAnsi="Calibri"/>
+          <w:i/>
+          <w:iCs/>
+          <w:color w:val="1F2937"/>
+          <w:sz w:val="20"/>
+          <w:szCs w:val="20"/>
+        </w:rPr>
+        <w:t xml:space="preserve">The 5% commission is Knot &amp; Bloom's revenue only. PayMongo deducts its own processing fee from the same held deposit before payout, on top of this commission — it is a real cost of doing business but not platform income. That combined cost (commission + PayMongo fee) is still well under the 20% deposit rate, which is the headroom this lower commission was set to protect.</w:t>
+      </w:r>
+    </w:p>
+    <w:p>
+      <w:pPr>
         <w:pStyle w:val="Heading1"/>
         <w:pBdr>
-          <w:bottom w:val="single" w:color="9C4A3C" w:sz="8" w:space="6"/>
+          <w:bottom w:val="single" w:color="B36979" w:sz="8" w:space="6"/>
         </w:pBdr>
         <w:spacing w:after="200" w:before="480"/>
       </w:pPr>
@@ -3518,7 +3550,7 @@
           <w:rFonts w:ascii="Georgia" w:cs="Georgia" w:eastAsia="Georgia" w:hAnsi="Georgia"/>
           <w:b/>
           <w:bCs/>
-          <w:color w:val="9C4A3C"/>
+          <w:color w:val="B36979"/>
           <w:sz w:val="30"/>
           <w:szCs w:val="30"/>
         </w:rPr>
@@ -3535,7 +3567,7 @@
           <w:rFonts w:ascii="Calibri" w:cs="Calibri" w:eastAsia="Calibri" w:hAnsi="Calibri"/>
           <w:b/>
           <w:bCs/>
-          <w:color w:val="5B6B4F"/>
+          <w:color w:val="567F4F"/>
           <w:sz w:val="22"/>
           <w:szCs w:val="22"/>
         </w:rPr>
@@ -3554,11 +3586,11 @@
       <w:r>
         <w:rPr>
           <w:rFonts w:ascii="Calibri" w:cs="Calibri" w:eastAsia="Calibri" w:hAnsi="Calibri"/>
-          <w:color w:val="2B2118"/>
-          <w:sz w:val="21"/>
-          <w:szCs w:val="21"/>
-        </w:rPr>
-        <w:t xml:space="preserve">Free tier only — single flat 12% commission, no subscription complexity</w:t>
+          <w:color w:val="1F2937"/>
+          <w:sz w:val="21"/>
+          <w:szCs w:val="21"/>
+        </w:rPr>
+        <w:t xml:space="preserve">Free tier only — single flat 5% commission, no subscription complexity</w:t>
       </w:r>
     </w:p>
     <w:p>
@@ -3573,7 +3605,7 @@
       <w:r>
         <w:rPr>
           <w:rFonts w:ascii="Calibri" w:cs="Calibri" w:eastAsia="Calibri" w:hAnsi="Calibri"/>
-          <w:color w:val="2B2118"/>
+          <w:color w:val="1F2937"/>
           <w:sz w:val="21"/>
           <w:szCs w:val="21"/>
         </w:rPr>
@@ -3592,7 +3624,7 @@
       <w:r>
         <w:rPr>
           <w:rFonts w:ascii="Calibri" w:cs="Calibri" w:eastAsia="Calibri" w:hAnsi="Calibri"/>
-          <w:color w:val="2B2118"/>
+          <w:color w:val="1F2937"/>
           <w:sz w:val="21"/>
           <w:szCs w:val="21"/>
         </w:rPr>
@@ -3609,7 +3641,7 @@
           <w:rFonts w:ascii="Calibri" w:cs="Calibri" w:eastAsia="Calibri" w:hAnsi="Calibri"/>
           <w:b/>
           <w:bCs/>
-          <w:color w:val="5B6B4F"/>
+          <w:color w:val="567F4F"/>
           <w:sz w:val="22"/>
           <w:szCs w:val="22"/>
         </w:rPr>
@@ -3625,7 +3657,7 @@
           <w:rFonts w:ascii="Calibri" w:cs="Calibri" w:eastAsia="Calibri" w:hAnsi="Calibri"/>
           <w:b/>
           <w:bCs/>
-          <w:color w:val="9C4A3C"/>
+          <w:color w:val="B36979"/>
           <w:sz w:val="21"/>
           <w:szCs w:val="21"/>
         </w:rPr>
@@ -3634,7 +3666,7 @@
       <w:r>
         <w:rPr>
           <w:rFonts w:ascii="Calibri" w:cs="Calibri" w:eastAsia="Calibri" w:hAnsi="Calibri"/>
-          <w:color w:val="2B2118"/>
+          <w:color w:val="1F2937"/>
           <w:sz w:val="21"/>
           <w:szCs w:val="21"/>
         </w:rPr>
@@ -3653,7 +3685,7 @@
       <w:r>
         <w:rPr>
           <w:rFonts w:ascii="Calibri" w:cs="Calibri" w:eastAsia="Calibri" w:hAnsi="Calibri"/>
-          <w:color w:val="2B2118"/>
+          <w:color w:val="1F2937"/>
           <w:sz w:val="21"/>
           <w:szCs w:val="21"/>
         </w:rPr>
@@ -3672,7 +3704,7 @@
       <w:r>
         <w:rPr>
           <w:rFonts w:ascii="Calibri" w:cs="Calibri" w:eastAsia="Calibri" w:hAnsi="Calibri"/>
-          <w:color w:val="2B2118"/>
+          <w:color w:val="1F2937"/>
           <w:sz w:val="21"/>
           <w:szCs w:val="21"/>
         </w:rPr>
@@ -3683,7 +3715,7 @@
       <w:pPr>
         <w:pStyle w:val="Heading1"/>
         <w:pBdr>
-          <w:bottom w:val="single" w:color="9C4A3C" w:sz="8" w:space="6"/>
+          <w:bottom w:val="single" w:color="B36979" w:sz="8" w:space="6"/>
         </w:pBdr>
         <w:spacing w:after="200" w:before="480"/>
       </w:pPr>
@@ -3692,7 +3724,7 @@
           <w:rFonts w:ascii="Georgia" w:cs="Georgia" w:eastAsia="Georgia" w:hAnsi="Georgia"/>
           <w:b/>
           <w:bCs/>
-          <w:color w:val="9C4A3C"/>
+          <w:color w:val="B36979"/>
           <w:sz w:val="30"/>
           <w:szCs w:val="30"/>
         </w:rPr>
@@ -3708,7 +3740,7 @@
           <w:rFonts w:ascii="Calibri" w:cs="Calibri" w:eastAsia="Calibri" w:hAnsi="Calibri"/>
           <w:i w:val="false"/>
           <w:iCs w:val="false"/>
-          <w:color w:val="2B2118"/>
+          <w:color w:val="1F2937"/>
           <w:sz w:val="21"/>
           <w:szCs w:val="21"/>
         </w:rPr>
@@ -3725,7 +3757,7 @@
           <w:rFonts w:ascii="Calibri" w:cs="Calibri" w:eastAsia="Calibri" w:hAnsi="Calibri"/>
           <w:b/>
           <w:bCs/>
-          <w:color w:val="5B6B4F"/>
+          <w:color w:val="567F4F"/>
           <w:sz w:val="22"/>
           <w:szCs w:val="22"/>
         </w:rPr>
@@ -3744,7 +3776,7 @@
       <w:r>
         <w:rPr>
           <w:rFonts w:ascii="Calibri" w:cs="Calibri" w:eastAsia="Calibri" w:hAnsi="Calibri"/>
-          <w:color w:val="2B2118"/>
+          <w:color w:val="1F2937"/>
           <w:sz w:val="21"/>
           <w:szCs w:val="21"/>
         </w:rPr>
@@ -3763,7 +3795,7 @@
       <w:r>
         <w:rPr>
           <w:rFonts w:ascii="Calibri" w:cs="Calibri" w:eastAsia="Calibri" w:hAnsi="Calibri"/>
-          <w:color w:val="2B2118"/>
+          <w:color w:val="1F2937"/>
           <w:sz w:val="21"/>
           <w:szCs w:val="21"/>
         </w:rPr>
@@ -3782,19 +3814,19 @@
       <w:r>
         <w:rPr>
           <w:rFonts w:ascii="Calibri" w:cs="Calibri" w:eastAsia="Calibri" w:hAnsi="Calibri"/>
-          <w:color w:val="2B2118"/>
-          <w:sz w:val="21"/>
-          <w:szCs w:val="21"/>
-        </w:rPr>
-        <w:t xml:space="preserve">On order completion, commission (12% of the full order value) is deducted from the held deposit, and the remainder is released to the seller</w:t>
+          <w:color w:val="1F2937"/>
+          <w:sz w:val="21"/>
+          <w:szCs w:val="21"/>
+        </w:rPr>
+        <w:t xml:space="preserve">On order completion, PayMongo deducts its own processing fee from the held deposit, Knot &amp; Bloom's commission (5% of the full order value) is deducted next, and the remainder is released to the seller</w:t>
       </w:r>
     </w:p>
     <w:p>
       <w:pPr>
         <w:pBdr>
-          <w:left w:val="single" w:color="9C4A3C" w:sz="24" w:space="8"/>
+          <w:left w:val="single" w:color="B36979" w:sz="24" w:space="8"/>
         </w:pBdr>
-        <w:shd w:fill="F1E3DF" w:val="clear"/>
+        <w:shd w:fill="E8D5D9" w:val="clear"/>
         <w:spacing w:after="160" w:before="100" w:line="276"/>
         <w:ind w:left="200"/>
       </w:pPr>
@@ -3803,7 +3835,7 @@
           <w:rFonts w:ascii="Calibri" w:cs="Calibri" w:eastAsia="Calibri" w:hAnsi="Calibri"/>
           <w:b/>
           <w:bCs/>
-          <w:color w:val="9C4A3C"/>
+          <w:color w:val="B36979"/>
           <w:sz w:val="19"/>
           <w:szCs w:val="19"/>
         </w:rPr>
@@ -3814,11 +3846,11 @@
           <w:rFonts w:ascii="Calibri" w:cs="Calibri" w:eastAsia="Calibri" w:hAnsi="Calibri"/>
           <w:i/>
           <w:iCs/>
-          <w:color w:val="2B2118"/>
+          <w:color w:val="1F2937"/>
           <w:sz w:val="20"/>
           <w:szCs w:val="20"/>
         </w:rPr>
-        <w:t xml:space="preserve">This mechanism only works because the deposit rate (20%) is set higher than the commission rate (12%). This is a hard constraint: commission may never be set higher than the prevailing deposit rate, or there is no held balance to deduct it from.</w:t>
+        <w:t xml:space="preserve">This mechanism only works because the deposit rate (20%) is set higher than the combined cost of the commission (5%) and PayMongo's own processing fee. This is a hard constraint: commission plus the PayMongo fee may never exceed the prevailing deposit rate, or there is no held balance to deduct them from.</w:t>
       </w:r>
     </w:p>
     <w:p>
@@ -3831,7 +3863,7 @@
           <w:rFonts w:ascii="Calibri" w:cs="Calibri" w:eastAsia="Calibri" w:hAnsi="Calibri"/>
           <w:b/>
           <w:bCs/>
-          <w:color w:val="5B6B4F"/>
+          <w:color w:val="567F4F"/>
           <w:sz w:val="22"/>
           <w:szCs w:val="22"/>
         </w:rPr>
@@ -3850,7 +3882,7 @@
       <w:r>
         <w:rPr>
           <w:rFonts w:ascii="Calibri" w:cs="Calibri" w:eastAsia="Calibri" w:hAnsi="Calibri"/>
-          <w:color w:val="2B2118"/>
+          <w:color w:val="1F2937"/>
           <w:sz w:val="21"/>
           <w:szCs w:val="21"/>
         </w:rPr>
@@ -3869,7 +3901,7 @@
       <w:r>
         <w:rPr>
           <w:rFonts w:ascii="Calibri" w:cs="Calibri" w:eastAsia="Calibri" w:hAnsi="Calibri"/>
-          <w:color w:val="2B2118"/>
+          <w:color w:val="1F2937"/>
           <w:sz w:val="21"/>
           <w:szCs w:val="21"/>
         </w:rPr>
@@ -3886,7 +3918,7 @@
           <w:rFonts w:ascii="Calibri" w:cs="Calibri" w:eastAsia="Calibri" w:hAnsi="Calibri"/>
           <w:b/>
           <w:bCs/>
-          <w:color w:val="5B6B4F"/>
+          <w:color w:val="567F4F"/>
           <w:sz w:val="22"/>
           <w:szCs w:val="22"/>
         </w:rPr>
@@ -3905,7 +3937,7 @@
       <w:r>
         <w:rPr>
           <w:rFonts w:ascii="Calibri" w:cs="Calibri" w:eastAsia="Calibri" w:hAnsi="Calibri"/>
-          <w:color w:val="2B2118"/>
+          <w:color w:val="1F2937"/>
           <w:sz w:val="21"/>
           <w:szCs w:val="21"/>
         </w:rPr>
@@ -3924,7 +3956,7 @@
       <w:r>
         <w:rPr>
           <w:rFonts w:ascii="Calibri" w:cs="Calibri" w:eastAsia="Calibri" w:hAnsi="Calibri"/>
-          <w:color w:val="2B2118"/>
+          <w:color w:val="1F2937"/>
           <w:sz w:val="21"/>
           <w:szCs w:val="21"/>
         </w:rPr>
@@ -3943,7 +3975,7 @@
       <w:r>
         <w:rPr>
           <w:rFonts w:ascii="Calibri" w:cs="Calibri" w:eastAsia="Calibri" w:hAnsi="Calibri"/>
-          <w:color w:val="2B2118"/>
+          <w:color w:val="1F2937"/>
           <w:sz w:val="21"/>
           <w:szCs w:val="21"/>
         </w:rPr>
@@ -3953,9 +3985,9 @@
     <w:p>
       <w:pPr>
         <w:pBdr>
-          <w:left w:val="single" w:color="9C4A3C" w:sz="24" w:space="8"/>
+          <w:left w:val="single" w:color="B36979" w:sz="24" w:space="8"/>
         </w:pBdr>
-        <w:shd w:fill="F1E3DF" w:val="clear"/>
+        <w:shd w:fill="E8D5D9" w:val="clear"/>
         <w:spacing w:after="160" w:before="100" w:line="276"/>
         <w:ind w:left="200"/>
       </w:pPr>
@@ -3964,7 +3996,7 @@
           <w:rFonts w:ascii="Calibri" w:cs="Calibri" w:eastAsia="Calibri" w:hAnsi="Calibri"/>
           <w:b/>
           <w:bCs/>
-          <w:color w:val="9C4A3C"/>
+          <w:color w:val="B36979"/>
           <w:sz w:val="19"/>
           <w:szCs w:val="19"/>
         </w:rPr>
@@ -3975,7 +4007,7 @@
           <w:rFonts w:ascii="Calibri" w:cs="Calibri" w:eastAsia="Calibri" w:hAnsi="Calibri"/>
           <w:i/>
           <w:iCs/>
-          <w:color w:val="2B2118"/>
+          <w:color w:val="1F2937"/>
           <w:sz w:val="20"/>
           <w:szCs w:val="20"/>
         </w:rPr>
@@ -3991,7 +4023,7 @@
       <w:pPr>
         <w:pStyle w:val="Heading1"/>
         <w:pBdr>
-          <w:bottom w:val="single" w:color="9C4A3C" w:sz="8" w:space="6"/>
+          <w:bottom w:val="single" w:color="B36979" w:sz="8" w:space="6"/>
         </w:pBdr>
         <w:spacing w:after="200" w:before="480"/>
       </w:pPr>
@@ -4000,7 +4032,7 @@
           <w:rFonts w:ascii="Georgia" w:cs="Georgia" w:eastAsia="Georgia" w:hAnsi="Georgia"/>
           <w:b/>
           <w:bCs/>
-          <w:color w:val="9C4A3C"/>
+          <w:color w:val="B36979"/>
           <w:sz w:val="30"/>
           <w:szCs w:val="30"/>
         </w:rPr>
@@ -4027,7 +4059,7 @@
         <w:tc>
           <w:tcPr>
             <w:tcW w:type="dxa" w:w="2400"/>
-            <w:shd w:fill="F7F2EA" w:val="clear"/>
+            <w:shd w:fill="FCFAF9" w:val="clear"/>
             <w:tcMar>
               <w:top w:type="dxa" w:w="100"/>
               <w:left w:type="dxa" w:w="120"/>
@@ -4045,7 +4077,7 @@
                 <w:rFonts w:ascii="Calibri" w:cs="Calibri" w:eastAsia="Calibri" w:hAnsi="Calibri"/>
                 <w:b/>
                 <w:bCs/>
-                <w:color w:val="9C4A3C"/>
+                <w:color w:val="B36979"/>
                 <w:sz w:val="20"/>
                 <w:szCs w:val="20"/>
               </w:rPr>
@@ -4056,7 +4088,7 @@
         <w:tc>
           <w:tcPr>
             <w:tcW w:type="dxa" w:w="7300"/>
-            <w:shd w:fill="F7F2EA" w:val="clear"/>
+            <w:shd w:fill="FCFAF9" w:val="clear"/>
             <w:tcMar>
               <w:top w:type="dxa" w:w="100"/>
               <w:left w:type="dxa" w:w="120"/>
@@ -4074,7 +4106,7 @@
                 <w:rFonts w:ascii="Calibri" w:cs="Calibri" w:eastAsia="Calibri" w:hAnsi="Calibri"/>
                 <w:b w:val="false"/>
                 <w:bCs w:val="false"/>
-                <w:color w:val="2B2118"/>
+                <w:color w:val="1F2937"/>
                 <w:sz w:val="20"/>
                 <w:szCs w:val="20"/>
               </w:rPr>
@@ -4105,7 +4137,7 @@
                 <w:rFonts w:ascii="Calibri" w:cs="Calibri" w:eastAsia="Calibri" w:hAnsi="Calibri"/>
                 <w:b/>
                 <w:bCs/>
-                <w:color w:val="9C4A3C"/>
+                <w:color w:val="B36979"/>
                 <w:sz w:val="20"/>
                 <w:szCs w:val="20"/>
               </w:rPr>
@@ -4134,11 +4166,11 @@
                 <w:rFonts w:ascii="Calibri" w:cs="Calibri" w:eastAsia="Calibri" w:hAnsi="Calibri"/>
                 <w:b w:val="false"/>
                 <w:bCs w:val="false"/>
-                <w:color w:val="2B2118"/>
-                <w:sz w:val="20"/>
-                <w:szCs w:val="20"/>
-              </w:rPr>
-              <w:t xml:space="preserve">Any future commission rate must stay below the deposit rate (20%), or the payout mechanism breaks.</w:t>
+                <w:color w:val="1F2937"/>
+                <w:sz w:val="20"/>
+                <w:szCs w:val="20"/>
+              </w:rPr>
+              <w:t xml:space="preserve">Any future commission rate, combined with PayMongo's own processing fee, must stay below the deposit rate (20%), or the payout mechanism breaks.</w:t>
             </w:r>
           </w:p>
         </w:tc>
@@ -4147,7 +4179,7 @@
         <w:tc>
           <w:tcPr>
             <w:tcW w:type="dxa" w:w="2400"/>
-            <w:shd w:fill="F7F2EA" w:val="clear"/>
+            <w:shd w:fill="FCFAF9" w:val="clear"/>
             <w:tcMar>
               <w:top w:type="dxa" w:w="100"/>
               <w:left w:type="dxa" w:w="120"/>
@@ -4165,7 +4197,7 @@
                 <w:rFonts w:ascii="Calibri" w:cs="Calibri" w:eastAsia="Calibri" w:hAnsi="Calibri"/>
                 <w:b/>
                 <w:bCs/>
-                <w:color w:val="9C4A3C"/>
+                <w:color w:val="B36979"/>
                 <w:sz w:val="20"/>
                 <w:szCs w:val="20"/>
               </w:rPr>
@@ -4176,7 +4208,7 @@
         <w:tc>
           <w:tcPr>
             <w:tcW w:type="dxa" w:w="7300"/>
-            <w:shd w:fill="F7F2EA" w:val="clear"/>
+            <w:shd w:fill="FCFAF9" w:val="clear"/>
             <w:tcMar>
               <w:top w:type="dxa" w:w="100"/>
               <w:left w:type="dxa" w:w="120"/>
@@ -4194,7 +4226,7 @@
                 <w:rFonts w:ascii="Calibri" w:cs="Calibri" w:eastAsia="Calibri" w:hAnsi="Calibri"/>
                 <w:b w:val="false"/>
                 <w:bCs w:val="false"/>
-                <w:color w:val="2B2118"/>
+                <w:color w:val="1F2937"/>
                 <w:sz w:val="20"/>
                 <w:szCs w:val="20"/>
               </w:rPr>
@@ -4225,7 +4257,7 @@
                 <w:rFonts w:ascii="Calibri" w:cs="Calibri" w:eastAsia="Calibri" w:hAnsi="Calibri"/>
                 <w:b/>
                 <w:bCs/>
-                <w:color w:val="9C4A3C"/>
+                <w:color w:val="B36979"/>
                 <w:sz w:val="20"/>
                 <w:szCs w:val="20"/>
               </w:rPr>
@@ -4254,7 +4286,7 @@
                 <w:rFonts w:ascii="Calibri" w:cs="Calibri" w:eastAsia="Calibri" w:hAnsi="Calibri"/>
                 <w:b w:val="false"/>
                 <w:bCs w:val="false"/>
-                <w:color w:val="2B2118"/>
+                <w:color w:val="1F2937"/>
                 <w:sz w:val="20"/>
                 <w:szCs w:val="20"/>
               </w:rPr>
@@ -4267,7 +4299,7 @@
         <w:tc>
           <w:tcPr>
             <w:tcW w:type="dxa" w:w="2400"/>
-            <w:shd w:fill="F7F2EA" w:val="clear"/>
+            <w:shd w:fill="FCFAF9" w:val="clear"/>
             <w:tcMar>
               <w:top w:type="dxa" w:w="100"/>
               <w:left w:type="dxa" w:w="120"/>
@@ -4285,7 +4317,7 @@
                 <w:rFonts w:ascii="Calibri" w:cs="Calibri" w:eastAsia="Calibri" w:hAnsi="Calibri"/>
                 <w:b/>
                 <w:bCs/>
-                <w:color w:val="9C4A3C"/>
+                <w:color w:val="B36979"/>
                 <w:sz w:val="20"/>
                 <w:szCs w:val="20"/>
               </w:rPr>
@@ -4296,7 +4328,7 @@
         <w:tc>
           <w:tcPr>
             <w:tcW w:type="dxa" w:w="7300"/>
-            <w:shd w:fill="F7F2EA" w:val="clear"/>
+            <w:shd w:fill="FCFAF9" w:val="clear"/>
             <w:tcMar>
               <w:top w:type="dxa" w:w="100"/>
               <w:left w:type="dxa" w:w="120"/>
@@ -4314,7 +4346,7 @@
                 <w:rFonts w:ascii="Calibri" w:cs="Calibri" w:eastAsia="Calibri" w:hAnsi="Calibri"/>
                 <w:b w:val="false"/>
                 <w:bCs w:val="false"/>
-                <w:color w:val="2B2118"/>
+                <w:color w:val="1F2937"/>
                 <w:sz w:val="20"/>
                 <w:szCs w:val="20"/>
               </w:rPr>
@@ -4333,7 +4365,7 @@
           <w:rFonts w:ascii="Calibri" w:cs="Calibri" w:eastAsia="Calibri" w:hAnsi="Calibri"/>
           <w:i/>
           <w:iCs/>
-          <w:color w:val="2B2118"/>
+          <w:color w:val="1F2937"/>
           <w:sz w:val="21"/>
           <w:szCs w:val="21"/>
         </w:rPr>
@@ -4402,7 +4434,7 @@
     <w:r>
       <w:rPr>
         <w:rFonts w:ascii="Calibri" w:cs="Calibri" w:eastAsia="Calibri" w:hAnsi="Calibri"/>
-        <w:color w:val="6B6459"/>
+        <w:color w:val="4B5563"/>
         <w:sz w:val="16"/>
         <w:szCs w:val="16"/>
       </w:rPr>
@@ -4411,7 +4443,7 @@
     <w:r>
       <w:rPr>
         <w:rFonts w:ascii="Calibri" w:cs="Calibri" w:eastAsia="Calibri" w:hAnsi="Calibri"/>
-        <w:color w:val="6B6459"/>
+        <w:color w:val="4B5563"/>
         <w:sz w:val="16"/>
         <w:szCs w:val="16"/>
       </w:rPr>
@@ -4423,7 +4455,7 @@
     <w:r>
       <w:rPr>
         <w:rFonts w:ascii="Calibri" w:cs="Calibri" w:eastAsia="Calibri" w:hAnsi="Calibri"/>
-        <w:color w:val="6B6459"/>
+        <w:color w:val="4B5563"/>
         <w:sz w:val="16"/>
         <w:szCs w:val="16"/>
       </w:rPr>
@@ -4432,7 +4464,7 @@
     <w:r>
       <w:rPr>
         <w:rFonts w:ascii="Calibri" w:cs="Calibri" w:eastAsia="Calibri" w:hAnsi="Calibri"/>
-        <w:color w:val="6B6459"/>
+        <w:color w:val="4B5563"/>
         <w:sz w:val="16"/>
         <w:szCs w:val="16"/>
       </w:rPr>
@@ -4494,7 +4526,7 @@
     <w:r>
       <w:rPr>
         <w:rFonts w:ascii="Calibri" w:cs="Calibri" w:eastAsia="Calibri" w:hAnsi="Calibri"/>
-        <w:color w:val="6B6459"/>
+        <w:color w:val="4B5563"/>
         <w:sz w:val="16"/>
         <w:szCs w:val="16"/>
       </w:rPr>
@@ -4632,7 +4664,7 @@
     <w:rPrDefault>
       <w:rPr>
         <w:rFonts w:ascii="Calibri" w:cs="Calibri" w:eastAsia="Calibri" w:hAnsi="Calibri"/>
-        <w:color w:val="2B2118"/>
+        <w:color w:val="1F2937"/>
         <w:sz w:val="21"/>
         <w:szCs w:val="21"/>
       </w:rPr>
@@ -4655,7 +4687,7 @@
     <w:next w:val="Normal"/>
     <w:qFormat/>
     <w:rPr>
-      <w:color w:val="2E74B5"/>
+      <w:color w:val="B36979"/>
       <w:sz w:val="32"/>
       <w:szCs w:val="32"/>
     </w:rPr>
@@ -4666,7 +4698,7 @@
     <w:next w:val="Normal"/>
     <w:qFormat/>
     <w:rPr>
-      <w:color w:val="2E74B5"/>
+      <w:color w:val="B36979"/>
       <w:sz w:val="26"/>
       <w:szCs w:val="26"/>
     </w:rPr>
@@ -4677,7 +4709,7 @@
     <w:next w:val="Normal"/>
     <w:qFormat/>
     <w:rPr>
-      <w:color w:val="1F4D78"/>
+      <w:color w:val="8F5461"/>
       <w:sz w:val="24"/>
       <w:szCs w:val="24"/>
     </w:rPr>
@@ -4690,7 +4722,7 @@
     <w:rPr>
       <w:i/>
       <w:iCs/>
-      <w:color w:val="2E74B5"/>
+      <w:color w:val="B36979"/>
     </w:rPr>
   </w:style>
   <w:style w:type="paragraph" w:styleId="Heading5">
@@ -4699,7 +4731,7 @@
     <w:next w:val="Normal"/>
     <w:qFormat/>
     <w:rPr>
-      <w:color w:val="2E74B5"/>
+      <w:color w:val="B36979"/>
     </w:rPr>
   </w:style>
   <w:style w:type="paragraph" w:styleId="Heading6">
@@ -4708,7 +4740,7 @@
     <w:next w:val="Normal"/>
     <w:qFormat/>
     <w:rPr>
-      <w:color w:val="1F4D78"/>
+      <w:color w:val="8F5461"/>
     </w:rPr>
   </w:style>
   <w:style w:type="paragraph" w:styleId="Strong">
@@ -4732,7 +4764,7 @@
     <w:uiPriority w:val="99"/>
     <w:unhideWhenUsed/>
     <w:rPr>
-      <w:color w:val="0563C1"/>
+      <w:color w:val="B36979"/>
       <w:u w:val="single"/>
     </w:rPr>
   </w:style>

</xml_diff>